<commit_message>
docs(specs): drop the 21/10 and 23/10 rows from the SRS record of changes
</commit_message>
<xml_diff>
--- a/specs/CryptoPilot_Report3_SRS.docx
+++ b/specs/CryptoPilot_Report3_SRS.docx
@@ -3225,182 +3225,6 @@
               <w:rPr>
                 <w:rtl w:val="0"/>
               </w:rPr>
-            </w:r>
-          </w:p>
-        </w:tc>
-      </w:tr>
-      <w:tr>
-        <w:trPr>
-          <w:cantSplit w:val="0"/>
-          <w:tblHeader w:val="0"/>
-        </w:trPr>
-        <w:tc>
-          <w:tcPr/>
-          <w:p>
-            <w:pPr>
-              <w:jc w:val="center"/>
-              <w:rPr/>
-            </w:pPr>
-            <w:r>
-              <w:rPr>
-                <w:sz w:val="19"/>
-                <w:szCs w:val="19"/>
-                <w:rtl w:val="0"/>
-              </w:rPr>
-              <w:t xml:space="preserve">21/10/2026</w:t>
-            </w:r>
-            <w:r>
-              <w:rPr>
-                <w:rtl w:val="0"/>
-              </w:rPr>
-            </w:r>
-          </w:p>
-        </w:tc>
-        <w:tc>
-          <w:tcPr/>
-          <w:p>
-            <w:pPr>
-              <w:jc w:val="center"/>
-              <w:rPr/>
-            </w:pPr>
-            <w:r>
-              <w:rPr>
-                <w:sz w:val="19"/>
-                <w:szCs w:val="19"/>
-                <w:rtl w:val="0"/>
-              </w:rPr>
-              <w:t xml:space="preserve">A, M</w:t>
-            </w:r>
-            <w:r>
-              <w:rPr>
-                <w:rtl w:val="0"/>
-              </w:rPr>
-            </w:r>
-          </w:p>
-        </w:tc>
-        <w:tc>
-          <w:tcPr/>
-          <w:p>
-            <w:pPr>
-              <w:rPr/>
-            </w:pPr>
-            <w:r>
-              <w:rPr>
-                <w:sz w:val="19"/>
-                <w:szCs w:val="19"/>
-                <w:rtl w:val="0"/>
-              </w:rPr>
-              <w:t xml:space="preserve">CryptoPilot Team</w:t>
-            </w:r>
-            <w:r>
-              <w:rPr>
-                <w:rtl w:val="0"/>
-              </w:rPr>
-            </w:r>
-          </w:p>
-        </w:tc>
-        <w:tc>
-          <w:tcPr/>
-          <w:p>
-            <w:pPr>
-              <w:rPr/>
-            </w:pPr>
-            <w:r>
-              <w:rPr>
-                <w:sz w:val="19"/>
-                <w:szCs w:val="19"/>
-                <w:rtl w:val="0"/>
-              </w:rPr>
-              <w:t>Aligned with the implemented system: realized, fee, funding and net profit/loss of a trade and the liquidation clearance fee (BR-35, BR-36, BR-38, BR-42, sections 3.5 and 3.6, MSG23, MSG24); added Demo Trading (section 3.12; UC-15, UC-19, UC-20, SCR-45 to SCR-47, NSF-19, NSF-20, BR-68 to BR-73, demo trading entities); community forum aligned with the registered topic (Guest read access, post removal by Admin, official post categories, video posting on PRO and PREMIUM), with search and the public member page (UC-06, SCR-48, section 3.7.5) and comment notifications; Futures MARKET entry at the mark price and fills from 1-minute candles (BR-33, section 3.5.4); settled funding rates in FUNDING_RATE_HISTORY; order book and trade streams (NSF-03); timeframe and threshold units of FUNDING_RATE and OPEN_INTEREST_CHANGE alerts; rate limits and MSG50; Market List without the setup score column; English user interface first (to confirm).</w:t>
-            </w:r>
-            <w:r>
-              <w:rPr>
-                <w:rtl w:val="0"/>
-              </w:rPr>
-            </w:r>
-          </w:p>
-        </w:tc>
-      </w:tr>
-      <w:tr>
-        <w:trPr>
-          <w:cantSplit w:val="0"/>
-          <w:tblHeader w:val="0"/>
-        </w:trPr>
-        <w:tc>
-          <w:tcPr/>
-          <w:p>
-            <w:pPr>
-              <w:jc w:val="center"/>
-              <w:rPr>
-                <w:sz w:val="19"/>
-                <w:szCs w:val="19"/>
-              </w:rPr>
-            </w:pPr>
-            <w:r>
-              <w:rPr>
-                <w:sz w:val="19"/>
-                <w:szCs w:val="19"/>
-                <w:rtl w:val="0"/>
-              </w:rPr>
-              <w:t xml:space="preserve">23/10/2026</w:t>
-            </w:r>
-          </w:p>
-        </w:tc>
-        <w:tc>
-          <w:tcPr/>
-          <w:p>
-            <w:pPr>
-              <w:jc w:val="center"/>
-              <w:rPr>
-                <w:sz w:val="19"/>
-                <w:szCs w:val="19"/>
-              </w:rPr>
-            </w:pPr>
-            <w:r>
-              <w:rPr>
-                <w:sz w:val="19"/>
-                <w:szCs w:val="19"/>
-                <w:rtl w:val="0"/>
-              </w:rPr>
-              <w:t xml:space="preserve">A, M</w:t>
-            </w:r>
-          </w:p>
-        </w:tc>
-        <w:tc>
-          <w:tcPr/>
-          <w:p>
-            <w:pPr>
-              <w:rPr>
-                <w:sz w:val="19"/>
-                <w:szCs w:val="19"/>
-              </w:rPr>
-            </w:pPr>
-            <w:r>
-              <w:rPr>
-                <w:sz w:val="19"/>
-                <w:szCs w:val="19"/>
-                <w:rtl w:val="0"/>
-              </w:rPr>
-              <w:t xml:space="preserve">CryptoPilot Team</w:t>
-            </w:r>
-          </w:p>
-        </w:tc>
-        <w:tc>
-          <w:tcPr/>
-          <w:p>
-            <w:pPr>
-              <w:rPr>
-                <w:sz w:val="19"/>
-                <w:szCs w:val="19"/>
-              </w:rPr>
-            </w:pPr>
-            <w:r>
-              <w:rPr>
-                <w:sz w:val="19"/>
-                <w:szCs w:val="19"/>
-                <w:rtl w:val="0"/>
-              </w:rPr>
-              <w:t xml:space="preserve">Supervisor feedback GY-03 of 07/10/2026 (trading plan validity, entry deviation and realistic fills): STOP (stop-market) entries, the INVALIDATED plan status and the optional invalidation price (BR-32, BR-33, BR-74, NSF-09, sections 3.5.1 to 3.5.4), entry deviation in R with confirmation and refusal of a late MARKET entry (BR-75, MSG51, MSG52), fees by liquidity role and simulated slippage (BR-36), the Futures last price from the 1-minute candle stream (BR-33, confirmed item 28), learning data of a simulated trade (BR-76, MSG55), plan expiry and invalidation notifications (MSG53, MSG54), settings of section 3.11.8, MSG16 for a price on the wrong side; a HIDDEN post cannot be edited and the media of a hidden or reported post is kept as moderation evidence (BR-47, section 3.7.2, MSG56); demo trading aligned with the implemented system: orders checked against the exchange filters of the pair and refused instead of rounded, idempotent order lists, pending orders of OTO and OTOCO, orders of a pair that stops trading cancelled (BR-69, BR-70, sections 3.12.3 and 3.12.6, NSF-01). The business rules of GY-03 are numbered BR-74 to BR-76 because BR-68 to BR-73 are the demo trading rules.</w:t>
             </w:r>
           </w:p>
         </w:tc>

</xml_diff>

<commit_message>
docs(specs): tidy the SRS wording and follow the implemented system
- Wording: profile fields, UC-04, UC-08, UC-15, UC-27 and UC-41
  descriptions, scope list, context flow 1, MSG03, section references.
- Market of interest added to SCR-07 and USER_PROFILE.
- Follows the code: the backend calls the AI Service over HTTP with a
  shared secret (4.1.3); test coverage of 95% lines and 90% branches
  (4.2.5); open decisions 2 to 6, 12, 19 and 21 are implemented and
  marked Confirmed.
- Removes the statements that following, voting and comment reports are
  excluded, since the code has them; they are not specified here.
</commit_message>
<xml_diff>
--- a/specs/CryptoPilot_Report3_SRS.docx
+++ b/specs/CryptoPilot_Report3_SRS.docx
@@ -3709,7 +3709,7 @@
                 <w:szCs w:val="19"/>
                 <w:rtl w:val="0"/>
               </w:rPr>
-              <w:t xml:space="preserve">Payment in cryptocurrency, automatic subscription renewal, cancellation with refund, in-system refunds, stored credit balance</w:t>
+              <w:t>Payment in cryptocurrency, automatic subscription renewal, refunds and stored credit balance</w:t>
             </w:r>
             <w:r>
               <w:rPr>
@@ -4177,7 +4177,7 @@
                 <w:szCs w:val="18"/>
                 <w:rtl w:val="0"/>
               </w:rPr>
-              <w:t xml:space="preserve">Registration details, email verification code, login credentials, password reset request, new password</w:t>
+              <w:t>Registration details, email verification token, login credentials, password reset request, new password</w:t>
             </w:r>
             <w:r>
               <w:rPr>
@@ -10848,7 +10848,7 @@
                 <w:szCs w:val="19"/>
                 <w:rtl w:val="0"/>
               </w:rPr>
-              <w:t>Internal timer (secondary actor) that starts the system use cases UC-47 to UC-52, which are realized by the non-screen functions of Section 3.1.4.</w:t>
+              <w:t>Internal timer (secondary actor) that starts the system use cases UC-47 to UC-52, which are realized by the non-screen functions of section 3.1.4.</w:t>
             </w:r>
           </w:p>
         </w:tc>
@@ -10914,7 +10914,7 @@
         <w:rPr>
           <w:rtl w:val="0"/>
         </w:rPr>
-        <w:t>Guest and Trader are drawn on the left of the diagram, Admin and the external systems on the right. A secondary actor is associated with a use case only when CryptoPilot exchanges data with it to produce the result of that use case. Steps, alternative flows and variants of a use case are specified in Section 3 and are not drawn as separate use cases; the function description of each requirement in Section 3 names the use cases it realizes.</w:t>
+        <w:t>Guest and Trader are drawn on the left of the diagram, Admin and the external systems on the right. A secondary actor is associated with a use case only when CryptoPilot exchanges data with it to produce the result of that use case. Steps, alternative flows and variants of a use case are specified in section 3 and are not drawn as separate use cases; the function description of each requirement in section 3 names the use cases it realizes.</w:t>
       </w:r>
     </w:p>
     <w:p>
@@ -11435,7 +11435,7 @@
                 <w:szCs w:val="18"/>
                 <w:rtl w:val="0"/>
               </w:rPr>
-              <w:t>User searches the enabled pairs by symbol or coin name.</w:t>
+              <w:t>User searches the enabled pairs by symbol.</w:t>
             </w:r>
           </w:p>
         </w:tc>
@@ -11715,7 +11715,7 @@
                 <w:szCs w:val="18"/>
                 <w:rtl w:val="0"/>
               </w:rPr>
-              <w:t>Trader sets the default capital and the maximum risk per trade and the risk profile, optionally using the profile suggested by the risk questionnaire; the values pre-fill new trading plans.</w:t>
+              <w:t>Trader sets the default capital, the maximum risk per trade and the risk profile, optionally using the profile suggested by the risk questionnaire; the values pre-fill new trading plans.</w:t>
             </w:r>
           </w:p>
         </w:tc>
@@ -12205,7 +12205,7 @@
                 <w:szCs w:val="18"/>
                 <w:rtl w:val="0"/>
               </w:rPr>
-              <w:t>Trader places a demo Spot order (limit, market, post-only, stop, trailing stop, OCO, OTO, OTOCO) without a trading plan; the order is matched against live Binance prices and order book. Includes UC-16.</w:t>
+              <w:t>Trader places a demo Spot order (limit, market, post-only, stop limit, stop market, trailing stop, OCO, OTO or OTOCO) without a trading plan; the order is matched against live Binance prices and order book. Includes UC-16.</w:t>
             </w:r>
           </w:p>
         </w:tc>
@@ -13045,7 +13045,7 @@
                 <w:szCs w:val="18"/>
                 <w:rtl w:val="0"/>
               </w:rPr>
-              <w:t>Trader comments on a post or replies to a comment and edits or deletes own comments, likes or unlikes a post or a comment, and bookmarks posts and views the saved posts.</w:t>
+              <w:t>Trader comments on a post or replies to a comment, edits or deletes own comments, likes or unlikes posts and comments, and saves posts and views the saved posts.</w:t>
             </w:r>
           </w:p>
         </w:tc>
@@ -14025,7 +14025,7 @@
                 <w:szCs w:val="18"/>
                 <w:rtl w:val="0"/>
               </w:rPr>
-              <w:t>Admin creates and activates AI configuration versions: provider model, system prompt and templates, disclaimer and generation parameters.</w:t>
+              <w:t>Admin creates and activates AI configuration versions: model, system prompt and templates, disclaimer and generation parameters.</w:t>
             </w:r>
           </w:p>
         </w:tc>
@@ -16012,7 +16012,7 @@
                 <w:szCs w:val="18"/>
                 <w:rtl w:val="0"/>
               </w:rPr>
-              <w:t xml:space="preserve">Tabs: Profile (display name, avatar, default capital, risk %, trading style, risk profile and risk questionnaire), Security (change password), Notifications (email and push), Subscription (current plan, end date, scheduled subscriptions, usage of limits and AI quota, links to SCR-30 and SCR-32).</w:t>
+              <w:t>Tabs: Profile (display name, avatar, default capital, risk %, trading style, risk profile, market of interest and risk questionnaire), Security (change password), Notifications (email and push), Subscription (current plan, end date, scheduled subscriptions, usage of limits and AI quota, links to SCR-30 and SCR-32).</w:t>
             </w:r>
             <w:r>
               <w:rPr>
@@ -25159,7 +25159,7 @@
                 <w:szCs w:val="18"/>
                 <w:rtl w:val="0"/>
               </w:rPr>
-              <w:t xml:space="preserve">One-to-one profile of a user: display name, avatar, default capital, default risk %, trading style, risk profile, notification preferences.</w:t>
+              <w:t>One-to-one profile of a user: display name, avatar, default capital, default risk %, trading style, risk profile, market of interest, notification preferences.</w:t>
             </w:r>
             <w:r>
               <w:rPr>
@@ -29304,7 +29304,7 @@
           <w:color w:val="000000"/>
           <w:rtl w:val="0"/>
         </w:rPr>
-        <w:t>Profile tab: display name (2-50 characters), avatar (JPG, PNG or WEBP, maximum 2 MB, stored in Media Storage), default capital (greater than 0), default risk % (0.1-10, BR-30; initially the risk per trade of the risk profile), trading style (SCALPING, DAY, SWING, POSITION; selects the setup score preset, BR-13) and risk profile (CONSERVATIVE, BALANCED, AGGRESSIVE; default CONSERVATIVE, BR-66) and market of interest (SPOT or FUTURES; default SPOT), which opens the market overview and a new trading plan on that market; FUTURES is applied only while the effective plan includes Futures analysis (BR-62). Default capital and risk % pre-fill new trading plans.</w:t>
+        <w:t>Profile tab: display name (2-50 characters), avatar (JPG, PNG or WEBP, maximum 2 MB, stored in Media Storage), default capital (greater than 0), default risk % (0.1-10, BR-30; initially the risk per trade of the risk profile), trading style (SCALPING, DAY, SWING, POSITION; selects the setup score preset, BR-13), risk profile (CONSERVATIVE, BALANCED, AGGRESSIVE; default CONSERVATIVE, BR-66) and market of interest (SPOT or FUTURES; default SPOT), which opens the market overview and a new trading plan on that market; FUTURES is applied only while the effective plan includes Futures analysis (BR-62). Default capital and risk % pre-fill new trading plans.</w:t>
       </w:r>
       <w:r>
         <w:rPr>
@@ -42113,7 +42113,7 @@
           <w:color w:val="000000"/>
           <w:rtl w:val="0"/>
         </w:rPr>
-        <w:t xml:space="preserve">The monolithic backend and the AI Service communicate over the private network of the deployment through an internal request queue; the AI Service is not exposed to the Internet.</w:t>
+        <w:t>The monolithic backend calls the AI Service over HTTP on the private network of the deployment, authenticated with a shared secret; the AI Service holds the LLM Provider key and is not exposed to the Internet.</w:t>
       </w:r>
       <w:r>
         <w:rPr>
@@ -43636,7 +43636,7 @@
           <w:color w:val="000000"/>
           <w:rtl w:val="0"/>
         </w:rPr>
-        <w:t xml:space="preserve">Every formula in section 5.1 is covered by automated unit tests; business logic has at least 70% line coverage.</w:t>
+        <w:t>Every formula in section 5.1 is covered by automated unit tests; the automated tests cover at least 95% of the lines and 90% of the branches, and at least 90% of the lines of every calculation package.</w:t>
       </w:r>
       <w:r>
         <w:rPr>
@@ -48536,7 +48536,7 @@
                 <w:szCs w:val="17"/>
                 <w:rtl w:val="0"/>
               </w:rPr>
-              <w:t xml:space="preserve">Password must be 8-64 characters and include uppercase, lowercase letters and a digit.</w:t>
+              <w:t>Password must be 8-64 characters and include an uppercase letter, a lowercase letter and a digit.</w:t>
             </w:r>
             <w:r>
               <w:rPr>
@@ -54784,12 +54784,7 @@
                 <w:szCs w:val="18"/>
                 <w:rtl w:val="0"/>
               </w:rPr>
-              <w:t xml:space="preserve">To confirm</w:t>
-            </w:r>
-            <w:r>
-              <w:rPr>
-                <w:rtl w:val="0"/>
-              </w:rPr>
+              <w:t>Confirmed</w:t>
             </w:r>
           </w:p>
         </w:tc>
@@ -54876,12 +54871,7 @@
                 <w:szCs w:val="18"/>
                 <w:rtl w:val="0"/>
               </w:rPr>
-              <w:t xml:space="preserve">To confirm</w:t>
-            </w:r>
-            <w:r>
-              <w:rPr>
-                <w:rtl w:val="0"/>
-              </w:rPr>
+              <w:t>Confirmed</w:t>
             </w:r>
           </w:p>
         </w:tc>
@@ -54968,12 +54958,7 @@
                 <w:szCs w:val="18"/>
                 <w:rtl w:val="0"/>
               </w:rPr>
-              <w:t xml:space="preserve">To confirm</w:t>
-            </w:r>
-            <w:r>
-              <w:rPr>
-                <w:rtl w:val="0"/>
-              </w:rPr>
+              <w:t>Confirmed</w:t>
             </w:r>
           </w:p>
         </w:tc>
@@ -55060,12 +55045,7 @@
                 <w:szCs w:val="18"/>
                 <w:rtl w:val="0"/>
               </w:rPr>
-              <w:t xml:space="preserve">To confirm</w:t>
-            </w:r>
-            <w:r>
-              <w:rPr>
-                <w:rtl w:val="0"/>
-              </w:rPr>
+              <w:t>Confirmed</w:t>
             </w:r>
           </w:p>
         </w:tc>
@@ -55152,12 +55132,7 @@
                 <w:szCs w:val="18"/>
                 <w:rtl w:val="0"/>
               </w:rPr>
-              <w:t xml:space="preserve">To confirm</w:t>
-            </w:r>
-            <w:r>
-              <w:rPr>
-                <w:rtl w:val="0"/>
-              </w:rPr>
+              <w:t>Confirmed</w:t>
             </w:r>
           </w:p>
         </w:tc>
@@ -55704,12 +55679,7 @@
                 <w:szCs w:val="18"/>
                 <w:rtl w:val="0"/>
               </w:rPr>
-              <w:t xml:space="preserve">To confirm</w:t>
-            </w:r>
-            <w:r>
-              <w:rPr>
-                <w:rtl w:val="0"/>
-              </w:rPr>
+              <w:t>Confirmed</w:t>
             </w:r>
           </w:p>
         </w:tc>
@@ -55866,7 +55836,7 @@
                 <w:szCs w:val="18"/>
                 <w:rtl w:val="0"/>
               </w:rPr>
-              <w:t xml:space="preserve">Only posts can be reported, following the conceptual model.</w:t>
+              <w:t>Posts are reported through SCR-27 (BR-46); this specification does not define the reporting of comments.</w:t>
             </w:r>
             <w:r>
               <w:rPr>
@@ -56348,12 +56318,7 @@
                 <w:szCs w:val="18"/>
                 <w:rtl w:val="0"/>
               </w:rPr>
-              <w:t xml:space="preserve">To confirm</w:t>
-            </w:r>
-            <w:r>
-              <w:rPr>
-                <w:rtl w:val="0"/>
-              </w:rPr>
+              <w:t>Confirmed</w:t>
             </w:r>
           </w:p>
         </w:tc>
@@ -56532,12 +56497,7 @@
                 <w:szCs w:val="18"/>
                 <w:rtl w:val="0"/>
               </w:rPr>
-              <w:t xml:space="preserve">To confirm</w:t>
-            </w:r>
-            <w:r>
-              <w:rPr>
-                <w:rtl w:val="0"/>
-              </w:rPr>
+              <w:t>Confirmed</w:t>
             </w:r>
           </w:p>
         </w:tc>
@@ -56970,7 +56930,7 @@
                 <w:szCs w:val="18"/>
                 <w:rtl w:val="0"/>
               </w:rPr>
-              <w:t xml:space="preserve">Follows the registered topic: Guests read posts and coin discussions, Admin can hide or remove reported posts, video posting on PRO and PREMIUM, official posts have a category; public member pages and search are added. Following, Bullish/Bearish voting, hashtags and polls are not included.</w:t>
+              <w:t>Follows the registered topic: Guests read posts and coin discussions, Admin can hide or remove reported posts, video posting on PRO and PREMIUM, official posts have a category; public member pages and search are added. Hashtags and polls are not included.</w:t>
             </w:r>
             <w:r>
               <w:rPr>

</xml_diff>

<commit_message>
docs(specs): match the SRS data entities to the database
Demo trading entities use the table names of V47 (WALLET_BALANCE, WALLET_LEDGER_ENTRY, ORDER_LIST, TRADE_ORDER, ORDER_FILL, EQUITY_SNAPSHOT); PAPER_ACCOUNT and PAPER_TRANSFER are removed. USER_RELATION, TRADING_JOURNAL_LEVEL_CHANGE and the four Academy entities are added; ENGAGEMENT and POST_REPORT follow V48. The SRS entities and the SDD tables now differ only by the technical tables.
</commit_message>
<xml_diff>
--- a/specs/CryptoPilot_Report3_SRS.docx
+++ b/specs/CryptoPilot_Report3_SRS.docx
@@ -25047,54 +25047,39 @@
                 <w:szCs w:val="18"/>
                 <w:rtl w:val="0"/>
               </w:rPr>
-              <w:t xml:space="preserve">1</w:t>
-            </w:r>
-            <w:r>
-              <w:rPr>
-                <w:rtl w:val="0"/>
-              </w:rPr>
-            </w:r>
-          </w:p>
-        </w:tc>
-        <w:tc>
-          <w:tcPr/>
-          <w:p>
-            <w:pPr>
-              <w:rPr/>
-            </w:pPr>
-            <w:r>
-              <w:rPr>
-                <w:sz w:val="18"/>
-                <w:szCs w:val="18"/>
-                <w:rtl w:val="0"/>
-              </w:rPr>
-              <w:t xml:space="preserve">USER</w:t>
-            </w:r>
-            <w:r>
-              <w:rPr>
-                <w:rtl w:val="0"/>
-              </w:rPr>
-            </w:r>
-          </w:p>
-        </w:tc>
-        <w:tc>
-          <w:tcPr/>
-          <w:p>
-            <w:pPr>
-              <w:rPr/>
-            </w:pPr>
-            <w:r>
-              <w:rPr>
-                <w:sz w:val="18"/>
-                <w:szCs w:val="18"/>
-                <w:rtl w:val="0"/>
-              </w:rPr>
-              <w:t xml:space="preserve">Account of a Trader or Admin: email, password hash, role, account status, verification and login times.</w:t>
-            </w:r>
-            <w:r>
-              <w:rPr>
-                <w:rtl w:val="0"/>
-              </w:rPr>
+              <w:t>1</w:t>
+            </w:r>
+          </w:p>
+        </w:tc>
+        <w:tc>
+          <w:tcPr/>
+          <w:p>
+            <w:pPr>
+              <w:rPr/>
+            </w:pPr>
+            <w:r>
+              <w:rPr>
+                <w:sz w:val="18"/>
+                <w:szCs w:val="18"/>
+                <w:rtl w:val="0"/>
+              </w:rPr>
+              <w:t>USER</w:t>
+            </w:r>
+          </w:p>
+        </w:tc>
+        <w:tc>
+          <w:tcPr/>
+          <w:p>
+            <w:pPr>
+              <w:rPr/>
+            </w:pPr>
+            <w:r>
+              <w:rPr>
+                <w:sz w:val="18"/>
+                <w:szCs w:val="18"/>
+                <w:rtl w:val="0"/>
+              </w:rPr>
+              <w:t>Account of a Trader or Admin: email, password hash, role, account status, verification and login times.</w:t>
             </w:r>
           </w:p>
         </w:tc>
@@ -25117,33 +25102,23 @@
                 <w:szCs w:val="18"/>
                 <w:rtl w:val="0"/>
               </w:rPr>
-              <w:t xml:space="preserve">2</w:t>
-            </w:r>
-            <w:r>
-              <w:rPr>
-                <w:rtl w:val="0"/>
-              </w:rPr>
-            </w:r>
-          </w:p>
-        </w:tc>
-        <w:tc>
-          <w:tcPr/>
-          <w:p>
-            <w:pPr>
-              <w:rPr/>
-            </w:pPr>
-            <w:r>
-              <w:rPr>
-                <w:sz w:val="18"/>
-                <w:szCs w:val="18"/>
-                <w:rtl w:val="0"/>
-              </w:rPr>
-              <w:t xml:space="preserve">USER_PROFILE</w:t>
-            </w:r>
-            <w:r>
-              <w:rPr>
-                <w:rtl w:val="0"/>
-              </w:rPr>
+              <w:t>2</w:t>
+            </w:r>
+          </w:p>
+        </w:tc>
+        <w:tc>
+          <w:tcPr/>
+          <w:p>
+            <w:pPr>
+              <w:rPr/>
+            </w:pPr>
+            <w:r>
+              <w:rPr>
+                <w:sz w:val="18"/>
+                <w:szCs w:val="18"/>
+                <w:rtl w:val="0"/>
+              </w:rPr>
+              <w:t>USER_PROFILE</w:t>
             </w:r>
           </w:p>
         </w:tc>
@@ -25160,11 +25135,6 @@
                 <w:rtl w:val="0"/>
               </w:rPr>
               <w:t>One-to-one profile of a user: display name, avatar, default capital, default risk %, trading style, risk profile, market of interest, notification preferences.</w:t>
-            </w:r>
-            <w:r>
-              <w:rPr>
-                <w:rtl w:val="0"/>
-              </w:rPr>
             </w:r>
           </w:p>
         </w:tc>
@@ -25187,54 +25157,39 @@
                 <w:szCs w:val="18"/>
                 <w:rtl w:val="0"/>
               </w:rPr>
-              <w:t xml:space="preserve">3</w:t>
-            </w:r>
-            <w:r>
-              <w:rPr>
-                <w:rtl w:val="0"/>
-              </w:rPr>
-            </w:r>
-          </w:p>
-        </w:tc>
-        <w:tc>
-          <w:tcPr/>
-          <w:p>
-            <w:pPr>
-              <w:rPr/>
-            </w:pPr>
-            <w:r>
-              <w:rPr>
-                <w:sz w:val="18"/>
-                <w:szCs w:val="18"/>
-                <w:rtl w:val="0"/>
-              </w:rPr>
-              <w:t xml:space="preserve">USER_TOKEN</w:t>
-            </w:r>
-            <w:r>
-              <w:rPr>
-                <w:rtl w:val="0"/>
-              </w:rPr>
-            </w:r>
-          </w:p>
-        </w:tc>
-        <w:tc>
-          <w:tcPr/>
-          <w:p>
-            <w:pPr>
-              <w:rPr/>
-            </w:pPr>
-            <w:r>
-              <w:rPr>
-                <w:sz w:val="18"/>
-                <w:szCs w:val="18"/>
-                <w:rtl w:val="0"/>
-              </w:rPr>
-              <w:t xml:space="preserve">Hashed tokens with expiry for email verification, password reset and session refresh.</w:t>
-            </w:r>
-            <w:r>
-              <w:rPr>
-                <w:rtl w:val="0"/>
-              </w:rPr>
+              <w:t>3</w:t>
+            </w:r>
+          </w:p>
+        </w:tc>
+        <w:tc>
+          <w:tcPr/>
+          <w:p>
+            <w:pPr>
+              <w:rPr/>
+            </w:pPr>
+            <w:r>
+              <w:rPr>
+                <w:sz w:val="18"/>
+                <w:szCs w:val="18"/>
+                <w:rtl w:val="0"/>
+              </w:rPr>
+              <w:t>USER_TOKEN</w:t>
+            </w:r>
+          </w:p>
+        </w:tc>
+        <w:tc>
+          <w:tcPr/>
+          <w:p>
+            <w:pPr>
+              <w:rPr/>
+            </w:pPr>
+            <w:r>
+              <w:rPr>
+                <w:sz w:val="18"/>
+                <w:szCs w:val="18"/>
+                <w:rtl w:val="0"/>
+              </w:rPr>
+              <w:t>Hashed tokens with expiry for email verification, password reset and session refresh.</w:t>
             </w:r>
           </w:p>
         </w:tc>
@@ -25257,54 +25212,39 @@
                 <w:szCs w:val="18"/>
                 <w:rtl w:val="0"/>
               </w:rPr>
-              <w:t xml:space="preserve">4</w:t>
-            </w:r>
-            <w:r>
-              <w:rPr>
-                <w:rtl w:val="0"/>
-              </w:rPr>
-            </w:r>
-          </w:p>
-        </w:tc>
-        <w:tc>
-          <w:tcPr/>
-          <w:p>
-            <w:pPr>
-              <w:rPr/>
-            </w:pPr>
-            <w:r>
-              <w:rPr>
-                <w:sz w:val="18"/>
-                <w:szCs w:val="18"/>
-                <w:rtl w:val="0"/>
-              </w:rPr>
-              <w:t xml:space="preserve">USER_DEVICE</w:t>
-            </w:r>
-            <w:r>
-              <w:rPr>
-                <w:rtl w:val="0"/>
-              </w:rPr>
-            </w:r>
-          </w:p>
-        </w:tc>
-        <w:tc>
-          <w:tcPr/>
-          <w:p>
-            <w:pPr>
-              <w:rPr/>
-            </w:pPr>
-            <w:r>
-              <w:rPr>
-                <w:sz w:val="18"/>
-                <w:szCs w:val="18"/>
-                <w:rtl w:val="0"/>
-              </w:rPr>
-              <w:t xml:space="preserve">Mobile devices of a user with the FCM token used for push notifications.</w:t>
-            </w:r>
-            <w:r>
-              <w:rPr>
-                <w:rtl w:val="0"/>
-              </w:rPr>
+              <w:t>4</w:t>
+            </w:r>
+          </w:p>
+        </w:tc>
+        <w:tc>
+          <w:tcPr/>
+          <w:p>
+            <w:pPr>
+              <w:rPr/>
+            </w:pPr>
+            <w:r>
+              <w:rPr>
+                <w:sz w:val="18"/>
+                <w:szCs w:val="18"/>
+                <w:rtl w:val="0"/>
+              </w:rPr>
+              <w:t>USER_DEVICE</w:t>
+            </w:r>
+          </w:p>
+        </w:tc>
+        <w:tc>
+          <w:tcPr/>
+          <w:p>
+            <w:pPr>
+              <w:rPr/>
+            </w:pPr>
+            <w:r>
+              <w:rPr>
+                <w:sz w:val="18"/>
+                <w:szCs w:val="18"/>
+                <w:rtl w:val="0"/>
+              </w:rPr>
+              <w:t>Mobile devices of a user with the FCM token used for push notifications.</w:t>
             </w:r>
           </w:p>
         </w:tc>
@@ -25327,54 +25267,39 @@
                 <w:szCs w:val="18"/>
                 <w:rtl w:val="0"/>
               </w:rPr>
-              <w:t xml:space="preserve">5</w:t>
-            </w:r>
-            <w:r>
-              <w:rPr>
-                <w:rtl w:val="0"/>
-              </w:rPr>
-            </w:r>
-          </w:p>
-        </w:tc>
-        <w:tc>
-          <w:tcPr/>
-          <w:p>
-            <w:pPr>
-              <w:rPr/>
-            </w:pPr>
-            <w:r>
-              <w:rPr>
-                <w:sz w:val="18"/>
-                <w:szCs w:val="18"/>
-                <w:rtl w:val="0"/>
-              </w:rPr>
-              <w:t xml:space="preserve">COIN</w:t>
-            </w:r>
-            <w:r>
-              <w:rPr>
-                <w:rtl w:val="0"/>
-              </w:rPr>
-            </w:r>
-          </w:p>
-        </w:tc>
-        <w:tc>
-          <w:tcPr/>
-          <w:p>
-            <w:pPr>
-              <w:rPr/>
-            </w:pPr>
-            <w:r>
-              <w:rPr>
-                <w:sz w:val="18"/>
-                <w:szCs w:val="18"/>
-                <w:rtl w:val="0"/>
-              </w:rPr>
-              <w:t xml:space="preserve">Crypto asset (e.g. BTC, ETH, USDT) used as base or quote of pairs and as tag of posts and news.</w:t>
-            </w:r>
-            <w:r>
-              <w:rPr>
-                <w:rtl w:val="0"/>
-              </w:rPr>
+              <w:t>5</w:t>
+            </w:r>
+          </w:p>
+        </w:tc>
+        <w:tc>
+          <w:tcPr/>
+          <w:p>
+            <w:pPr>
+              <w:rPr/>
+            </w:pPr>
+            <w:r>
+              <w:rPr>
+                <w:sz w:val="18"/>
+                <w:szCs w:val="18"/>
+                <w:rtl w:val="0"/>
+              </w:rPr>
+              <w:t>USER_RELATION</w:t>
+            </w:r>
+          </w:p>
+        </w:tc>
+        <w:tc>
+          <w:tcPr/>
+          <w:p>
+            <w:pPr>
+              <w:rPr/>
+            </w:pPr>
+            <w:r>
+              <w:rPr>
+                <w:sz w:val="18"/>
+                <w:szCs w:val="18"/>
+                <w:rtl w:val="0"/>
+              </w:rPr>
+              <w:t>Follow or block of one member by another (FOLLOW, BLOCK); a member cannot relate to themselves.</w:t>
             </w:r>
           </w:p>
         </w:tc>
@@ -25397,54 +25322,39 @@
                 <w:szCs w:val="18"/>
                 <w:rtl w:val="0"/>
               </w:rPr>
-              <w:t xml:space="preserve">6</w:t>
-            </w:r>
-            <w:r>
-              <w:rPr>
-                <w:rtl w:val="0"/>
-              </w:rPr>
-            </w:r>
-          </w:p>
-        </w:tc>
-        <w:tc>
-          <w:tcPr/>
-          <w:p>
-            <w:pPr>
-              <w:rPr/>
-            </w:pPr>
-            <w:r>
-              <w:rPr>
-                <w:sz w:val="18"/>
-                <w:szCs w:val="18"/>
-                <w:rtl w:val="0"/>
-              </w:rPr>
-              <w:t xml:space="preserve">CRYPTO_PAIR</w:t>
-            </w:r>
-            <w:r>
-              <w:rPr>
-                <w:rtl w:val="0"/>
-              </w:rPr>
-            </w:r>
-          </w:p>
-        </w:tc>
-        <w:tc>
-          <w:tcPr/>
-          <w:p>
-            <w:pPr>
-              <w:rPr/>
-            </w:pPr>
-            <w:r>
-              <w:rPr>
-                <w:sz w:val="18"/>
-                <w:szCs w:val="18"/>
-                <w:rtl w:val="0"/>
-              </w:rPr>
-              <w:t xml:space="preserve">Trading pair (e.g. BTCUSDT) with enabled markets, tick size, step size, minimum notional, maximum leverage and display order.</w:t>
-            </w:r>
-            <w:r>
-              <w:rPr>
-                <w:rtl w:val="0"/>
-              </w:rPr>
+              <w:t>6</w:t>
+            </w:r>
+          </w:p>
+        </w:tc>
+        <w:tc>
+          <w:tcPr/>
+          <w:p>
+            <w:pPr>
+              <w:rPr/>
+            </w:pPr>
+            <w:r>
+              <w:rPr>
+                <w:sz w:val="18"/>
+                <w:szCs w:val="18"/>
+                <w:rtl w:val="0"/>
+              </w:rPr>
+              <w:t>COIN</w:t>
+            </w:r>
+          </w:p>
+        </w:tc>
+        <w:tc>
+          <w:tcPr/>
+          <w:p>
+            <w:pPr>
+              <w:rPr/>
+            </w:pPr>
+            <w:r>
+              <w:rPr>
+                <w:sz w:val="18"/>
+                <w:szCs w:val="18"/>
+                <w:rtl w:val="0"/>
+              </w:rPr>
+              <w:t>Crypto asset (e.g. BTC, ETH, USDT) used as base or quote of pairs and as tag of posts and news.</w:t>
             </w:r>
           </w:p>
         </w:tc>
@@ -25467,54 +25377,39 @@
                 <w:szCs w:val="18"/>
                 <w:rtl w:val="0"/>
               </w:rPr>
-              <w:t xml:space="preserve">7</w:t>
-            </w:r>
-            <w:r>
-              <w:rPr>
-                <w:rtl w:val="0"/>
-              </w:rPr>
-            </w:r>
-          </w:p>
-        </w:tc>
-        <w:tc>
-          <w:tcPr/>
-          <w:p>
-            <w:pPr>
-              <w:rPr/>
-            </w:pPr>
-            <w:r>
-              <w:rPr>
-                <w:sz w:val="18"/>
-                <w:szCs w:val="18"/>
-                <w:rtl w:val="0"/>
-              </w:rPr>
-              <w:t xml:space="preserve">OHLCV</w:t>
-            </w:r>
-            <w:r>
-              <w:rPr>
-                <w:rtl w:val="0"/>
-              </w:rPr>
-            </w:r>
-          </w:p>
-        </w:tc>
-        <w:tc>
-          <w:tcPr/>
-          <w:p>
-            <w:pPr>
-              <w:rPr/>
-            </w:pPr>
-            <w:r>
-              <w:rPr>
-                <w:sz w:val="18"/>
-                <w:szCs w:val="18"/>
-                <w:rtl w:val="0"/>
-              </w:rPr>
-              <w:t xml:space="preserve">Closed candle of a pair per market type and timeframe: open, high, low, close, volume, trade count.</w:t>
-            </w:r>
-            <w:r>
-              <w:rPr>
-                <w:rtl w:val="0"/>
-              </w:rPr>
+              <w:t>7</w:t>
+            </w:r>
+          </w:p>
+        </w:tc>
+        <w:tc>
+          <w:tcPr/>
+          <w:p>
+            <w:pPr>
+              <w:rPr/>
+            </w:pPr>
+            <w:r>
+              <w:rPr>
+                <w:sz w:val="18"/>
+                <w:szCs w:val="18"/>
+                <w:rtl w:val="0"/>
+              </w:rPr>
+              <w:t>CRYPTO_PAIR</w:t>
+            </w:r>
+          </w:p>
+        </w:tc>
+        <w:tc>
+          <w:tcPr/>
+          <w:p>
+            <w:pPr>
+              <w:rPr/>
+            </w:pPr>
+            <w:r>
+              <w:rPr>
+                <w:sz w:val="18"/>
+                <w:szCs w:val="18"/>
+                <w:rtl w:val="0"/>
+              </w:rPr>
+              <w:t>Trading pair (e.g. BTCUSDT) with enabled markets, tick size, step size, minimum notional, maximum leverage and display order.</w:t>
             </w:r>
           </w:p>
         </w:tc>
@@ -25537,54 +25432,39 @@
                 <w:szCs w:val="18"/>
                 <w:rtl w:val="0"/>
               </w:rPr>
-              <w:t xml:space="preserve">8</w:t>
-            </w:r>
-            <w:r>
-              <w:rPr>
-                <w:rtl w:val="0"/>
-              </w:rPr>
-            </w:r>
-          </w:p>
-        </w:tc>
-        <w:tc>
-          <w:tcPr/>
-          <w:p>
-            <w:pPr>
-              <w:rPr/>
-            </w:pPr>
-            <w:r>
-              <w:rPr>
-                <w:sz w:val="18"/>
-                <w:szCs w:val="18"/>
-                <w:rtl w:val="0"/>
-              </w:rPr>
-              <w:t xml:space="preserve">TECHNICAL_INDICATOR</w:t>
-            </w:r>
-            <w:r>
-              <w:rPr>
-                <w:rtl w:val="0"/>
-              </w:rPr>
-            </w:r>
-          </w:p>
-        </w:tc>
-        <w:tc>
-          <w:tcPr/>
-          <w:p>
-            <w:pPr>
-              <w:rPr/>
-            </w:pPr>
-            <w:r>
-              <w:rPr>
-                <w:sz w:val="18"/>
-                <w:szCs w:val="18"/>
-                <w:rtl w:val="0"/>
-              </w:rPr>
-              <w:t xml:space="preserve">Indicators, nearest support/resistance and setup score component scores (with component version) computed for one closed candle; the setup score is computed when read by applying a preset (BR-13).</w:t>
-            </w:r>
-            <w:r>
-              <w:rPr>
-                <w:rtl w:val="0"/>
-              </w:rPr>
+              <w:t>8</w:t>
+            </w:r>
+          </w:p>
+        </w:tc>
+        <w:tc>
+          <w:tcPr/>
+          <w:p>
+            <w:pPr>
+              <w:rPr/>
+            </w:pPr>
+            <w:r>
+              <w:rPr>
+                <w:sz w:val="18"/>
+                <w:szCs w:val="18"/>
+                <w:rtl w:val="0"/>
+              </w:rPr>
+              <w:t>OHLCV</w:t>
+            </w:r>
+          </w:p>
+        </w:tc>
+        <w:tc>
+          <w:tcPr/>
+          <w:p>
+            <w:pPr>
+              <w:rPr/>
+            </w:pPr>
+            <w:r>
+              <w:rPr>
+                <w:sz w:val="18"/>
+                <w:szCs w:val="18"/>
+                <w:rtl w:val="0"/>
+              </w:rPr>
+              <w:t>Closed candle of a pair per market type and timeframe: open, high, low, close, volume, trade count.</w:t>
             </w:r>
           </w:p>
         </w:tc>
@@ -25607,54 +25487,39 @@
                 <w:szCs w:val="18"/>
                 <w:rtl w:val="0"/>
               </w:rPr>
-              <w:t xml:space="preserve">9</w:t>
-            </w:r>
-            <w:r>
-              <w:rPr>
-                <w:rtl w:val="0"/>
-              </w:rPr>
-            </w:r>
-          </w:p>
-        </w:tc>
-        <w:tc>
-          <w:tcPr/>
-          <w:p>
-            <w:pPr>
-              <w:rPr/>
-            </w:pPr>
-            <w:r>
-              <w:rPr>
-                <w:sz w:val="18"/>
-                <w:szCs w:val="18"/>
-                <w:rtl w:val="0"/>
-              </w:rPr>
-              <w:t xml:space="preserve">SPOT_MARKET_DATA</w:t>
-            </w:r>
-            <w:r>
-              <w:rPr>
-                <w:rtl w:val="0"/>
-              </w:rPr>
-            </w:r>
-          </w:p>
-        </w:tc>
-        <w:tc>
-          <w:tcPr/>
-          <w:p>
-            <w:pPr>
-              <w:rPr/>
-            </w:pPr>
-            <w:r>
-              <w:rPr>
-                <w:sz w:val="18"/>
-                <w:szCs w:val="18"/>
-                <w:rtl w:val="0"/>
-              </w:rPr>
-              <w:t xml:space="preserve">Periodic snapshot of spot market: last price, best bid/ask, 24h statistics.</w:t>
-            </w:r>
-            <w:r>
-              <w:rPr>
-                <w:rtl w:val="0"/>
-              </w:rPr>
+              <w:t>9</w:t>
+            </w:r>
+          </w:p>
+        </w:tc>
+        <w:tc>
+          <w:tcPr/>
+          <w:p>
+            <w:pPr>
+              <w:rPr/>
+            </w:pPr>
+            <w:r>
+              <w:rPr>
+                <w:sz w:val="18"/>
+                <w:szCs w:val="18"/>
+                <w:rtl w:val="0"/>
+              </w:rPr>
+              <w:t>TECHNICAL_INDICATOR</w:t>
+            </w:r>
+          </w:p>
+        </w:tc>
+        <w:tc>
+          <w:tcPr/>
+          <w:p>
+            <w:pPr>
+              <w:rPr/>
+            </w:pPr>
+            <w:r>
+              <w:rPr>
+                <w:sz w:val="18"/>
+                <w:szCs w:val="18"/>
+                <w:rtl w:val="0"/>
+              </w:rPr>
+              <w:t>Indicators, nearest support/resistance and setup score component scores (with component version) computed for one closed candle; the setup score is computed when read by applying a preset (BR-13).</w:t>
             </w:r>
           </w:p>
         </w:tc>
@@ -25677,54 +25542,39 @@
                 <w:szCs w:val="18"/>
                 <w:rtl w:val="0"/>
               </w:rPr>
-              <w:t xml:space="preserve">10</w:t>
-            </w:r>
-            <w:r>
-              <w:rPr>
-                <w:rtl w:val="0"/>
-              </w:rPr>
-            </w:r>
-          </w:p>
-        </w:tc>
-        <w:tc>
-          <w:tcPr/>
-          <w:p>
-            <w:pPr>
-              <w:rPr/>
-            </w:pPr>
-            <w:r>
-              <w:rPr>
-                <w:sz w:val="18"/>
-                <w:szCs w:val="18"/>
-                <w:rtl w:val="0"/>
-              </w:rPr>
-              <w:t xml:space="preserve">FUTURES_MARKET_DATA</w:t>
-            </w:r>
-            <w:r>
-              <w:rPr>
-                <w:rtl w:val="0"/>
-              </w:rPr>
-            </w:r>
-          </w:p>
-        </w:tc>
-        <w:tc>
-          <w:tcPr/>
-          <w:p>
-            <w:pPr>
-              <w:rPr/>
-            </w:pPr>
-            <w:r>
-              <w:rPr>
-                <w:sz w:val="18"/>
-                <w:szCs w:val="18"/>
-                <w:rtl w:val="0"/>
-              </w:rPr>
-              <w:t xml:space="preserve">Periodic snapshot of futures market: mark and index price, funding rate, open interest, long/short ratio.</w:t>
-            </w:r>
-            <w:r>
-              <w:rPr>
-                <w:rtl w:val="0"/>
-              </w:rPr>
+              <w:t>10</w:t>
+            </w:r>
+          </w:p>
+        </w:tc>
+        <w:tc>
+          <w:tcPr/>
+          <w:p>
+            <w:pPr>
+              <w:rPr/>
+            </w:pPr>
+            <w:r>
+              <w:rPr>
+                <w:sz w:val="18"/>
+                <w:szCs w:val="18"/>
+                <w:rtl w:val="0"/>
+              </w:rPr>
+              <w:t>SPOT_MARKET_DATA</w:t>
+            </w:r>
+          </w:p>
+        </w:tc>
+        <w:tc>
+          <w:tcPr/>
+          <w:p>
+            <w:pPr>
+              <w:rPr/>
+            </w:pPr>
+            <w:r>
+              <w:rPr>
+                <w:sz w:val="18"/>
+                <w:szCs w:val="18"/>
+                <w:rtl w:val="0"/>
+              </w:rPr>
+              <w:t>Periodic snapshot of spot market: last price, best bid/ask, 24h statistics.</w:t>
             </w:r>
           </w:p>
         </w:tc>
@@ -25743,51 +25593,43 @@
             </w:pPr>
             <w:r>
               <w:rPr>
-                <w:rtl w:val="0"/>
-              </w:rPr>
-              <w:t xml:space="preserve">11</w:t>
-            </w:r>
-          </w:p>
-        </w:tc>
-        <w:tc>
-          <w:tcPr/>
-          <w:p>
-            <w:pPr>
-              <w:rPr/>
-            </w:pPr>
-            <w:r>
-              <w:rPr>
-                <w:sz w:val="18"/>
-                <w:szCs w:val="18"/>
-                <w:rtl w:val="0"/>
-              </w:rPr>
-              <w:t xml:space="preserve">FUNDING_RATE_HISTORY</w:t>
-            </w:r>
-            <w:r>
-              <w:rPr>
-                <w:rtl w:val="0"/>
-              </w:rPr>
-            </w:r>
-          </w:p>
-        </w:tc>
-        <w:tc>
-          <w:tcPr/>
-          <w:p>
-            <w:pPr>
-              <w:rPr/>
-            </w:pPr>
-            <w:r>
-              <w:rPr>
-                <w:sz w:val="18"/>
-                <w:szCs w:val="18"/>
-                <w:rtl w:val="0"/>
-              </w:rPr>
-              <w:t xml:space="preserve">Settled funding rate of a futures pair at each funding time with the mark price; kept without retention because simulated profit/loss depends on it (BR-37).</w:t>
-            </w:r>
-            <w:r>
-              <w:rPr>
-                <w:rtl w:val="0"/>
-              </w:rPr>
+                <w:sz w:val="18"/>
+                <w:szCs w:val="18"/>
+                <w:rtl w:val="0"/>
+              </w:rPr>
+              <w:t>11</w:t>
+            </w:r>
+          </w:p>
+        </w:tc>
+        <w:tc>
+          <w:tcPr/>
+          <w:p>
+            <w:pPr>
+              <w:rPr/>
+            </w:pPr>
+            <w:r>
+              <w:rPr>
+                <w:sz w:val="18"/>
+                <w:szCs w:val="18"/>
+                <w:rtl w:val="0"/>
+              </w:rPr>
+              <w:t>FUTURES_MARKET_DATA</w:t>
+            </w:r>
+          </w:p>
+        </w:tc>
+        <w:tc>
+          <w:tcPr/>
+          <w:p>
+            <w:pPr>
+              <w:rPr/>
+            </w:pPr>
+            <w:r>
+              <w:rPr>
+                <w:sz w:val="18"/>
+                <w:szCs w:val="18"/>
+                <w:rtl w:val="0"/>
+              </w:rPr>
+              <w:t>Periodic snapshot of futures market: mark and index price, funding rate, open interest, long/short ratio.</w:t>
             </w:r>
           </w:p>
         </w:tc>
@@ -25810,54 +25652,39 @@
                 <w:szCs w:val="18"/>
                 <w:rtl w:val="0"/>
               </w:rPr>
-              <w:t xml:space="preserve">12</w:t>
-            </w:r>
-            <w:r>
-              <w:rPr>
-                <w:rtl w:val="0"/>
-              </w:rPr>
-            </w:r>
-          </w:p>
-        </w:tc>
-        <w:tc>
-          <w:tcPr/>
-          <w:p>
-            <w:pPr>
-              <w:rPr/>
-            </w:pPr>
-            <w:r>
-              <w:rPr>
-                <w:sz w:val="18"/>
-                <w:szCs w:val="18"/>
-                <w:rtl w:val="0"/>
-              </w:rPr>
-              <w:t xml:space="preserve">LEVERAGE_BRACKET</w:t>
-            </w:r>
-            <w:r>
-              <w:rPr>
-                <w:rtl w:val="0"/>
-              </w:rPr>
-            </w:r>
-          </w:p>
-        </w:tc>
-        <w:tc>
-          <w:tcPr/>
-          <w:p>
-            <w:pPr>
-              <w:rPr/>
-            </w:pPr>
-            <w:r>
-              <w:rPr>
-                <w:sz w:val="18"/>
-                <w:szCs w:val="18"/>
-                <w:rtl w:val="0"/>
-              </w:rPr>
-              <w:t xml:space="preserve">Maintenance margin tiers of a futures pair (notional range, maximum leverage, maintenance margin rate) configured by Admin.</w:t>
-            </w:r>
-            <w:r>
-              <w:rPr>
-                <w:rtl w:val="0"/>
-              </w:rPr>
+              <w:t>12</w:t>
+            </w:r>
+          </w:p>
+        </w:tc>
+        <w:tc>
+          <w:tcPr/>
+          <w:p>
+            <w:pPr>
+              <w:rPr/>
+            </w:pPr>
+            <w:r>
+              <w:rPr>
+                <w:sz w:val="18"/>
+                <w:szCs w:val="18"/>
+                <w:rtl w:val="0"/>
+              </w:rPr>
+              <w:t>FUNDING_RATE_HISTORY</w:t>
+            </w:r>
+          </w:p>
+        </w:tc>
+        <w:tc>
+          <w:tcPr/>
+          <w:p>
+            <w:pPr>
+              <w:rPr/>
+            </w:pPr>
+            <w:r>
+              <w:rPr>
+                <w:sz w:val="18"/>
+                <w:szCs w:val="18"/>
+                <w:rtl w:val="0"/>
+              </w:rPr>
+              <w:t>Settled funding rate of a futures pair at each funding time with the mark price; kept without retention because simulated profit/loss depends on it (BR-37).</w:t>
             </w:r>
           </w:p>
         </w:tc>
@@ -25880,54 +25707,39 @@
                 <w:szCs w:val="18"/>
                 <w:rtl w:val="0"/>
               </w:rPr>
-              <w:t xml:space="preserve">13</w:t>
-            </w:r>
-            <w:r>
-              <w:rPr>
-                <w:rtl w:val="0"/>
-              </w:rPr>
-            </w:r>
-          </w:p>
-        </w:tc>
-        <w:tc>
-          <w:tcPr/>
-          <w:p>
-            <w:pPr>
-              <w:rPr/>
-            </w:pPr>
-            <w:r>
-              <w:rPr>
-                <w:sz w:val="18"/>
-                <w:szCs w:val="18"/>
-                <w:rtl w:val="0"/>
-              </w:rPr>
-              <w:t xml:space="preserve">WATCHLIST</w:t>
-            </w:r>
-            <w:r>
-              <w:rPr>
-                <w:rtl w:val="0"/>
-              </w:rPr>
-            </w:r>
-          </w:p>
-        </w:tc>
-        <w:tc>
-          <w:tcPr/>
-          <w:p>
-            <w:pPr>
-              <w:rPr/>
-            </w:pPr>
-            <w:r>
-              <w:rPr>
-                <w:sz w:val="18"/>
-                <w:szCs w:val="18"/>
-                <w:rtl w:val="0"/>
-              </w:rPr>
-              <w:t xml:space="preserve">A pair watched by a Trader, with label, order and note; unique per Trader and pair.</w:t>
-            </w:r>
-            <w:r>
-              <w:rPr>
-                <w:rtl w:val="0"/>
-              </w:rPr>
+              <w:t>13</w:t>
+            </w:r>
+          </w:p>
+        </w:tc>
+        <w:tc>
+          <w:tcPr/>
+          <w:p>
+            <w:pPr>
+              <w:rPr/>
+            </w:pPr>
+            <w:r>
+              <w:rPr>
+                <w:sz w:val="18"/>
+                <w:szCs w:val="18"/>
+                <w:rtl w:val="0"/>
+              </w:rPr>
+              <w:t>LEVERAGE_BRACKET</w:t>
+            </w:r>
+          </w:p>
+        </w:tc>
+        <w:tc>
+          <w:tcPr/>
+          <w:p>
+            <w:pPr>
+              <w:rPr/>
+            </w:pPr>
+            <w:r>
+              <w:rPr>
+                <w:sz w:val="18"/>
+                <w:szCs w:val="18"/>
+                <w:rtl w:val="0"/>
+              </w:rPr>
+              <w:t>Maintenance margin tiers of a futures pair (notional range, maximum leverage, maintenance margin rate) configured by Admin.</w:t>
             </w:r>
           </w:p>
         </w:tc>
@@ -25950,54 +25762,39 @@
                 <w:szCs w:val="18"/>
                 <w:rtl w:val="0"/>
               </w:rPr>
-              <w:t xml:space="preserve">14</w:t>
-            </w:r>
-            <w:r>
-              <w:rPr>
-                <w:rtl w:val="0"/>
-              </w:rPr>
-            </w:r>
-          </w:p>
-        </w:tc>
-        <w:tc>
-          <w:tcPr/>
-          <w:p>
-            <w:pPr>
-              <w:rPr/>
-            </w:pPr>
-            <w:r>
-              <w:rPr>
-                <w:sz w:val="18"/>
-                <w:szCs w:val="18"/>
-                <w:rtl w:val="0"/>
-              </w:rPr>
-              <w:t xml:space="preserve">ALERT</w:t>
-            </w:r>
-            <w:r>
-              <w:rPr>
-                <w:rtl w:val="0"/>
-              </w:rPr>
-            </w:r>
-          </w:p>
-        </w:tc>
-        <w:tc>
-          <w:tcPr/>
-          <w:p>
-            <w:pPr>
-              <w:rPr/>
-            </w:pPr>
-            <w:r>
-              <w:rPr>
-                <w:sz w:val="18"/>
-                <w:szCs w:val="18"/>
-                <w:rtl w:val="0"/>
-              </w:rPr>
-              <w:t xml:space="preserve">Price or indicator alert rule on a watchlist pair with trigger mode, cooldown, channels, status and expiry.</w:t>
-            </w:r>
-            <w:r>
-              <w:rPr>
-                <w:rtl w:val="0"/>
-              </w:rPr>
+              <w:t>14</w:t>
+            </w:r>
+          </w:p>
+        </w:tc>
+        <w:tc>
+          <w:tcPr/>
+          <w:p>
+            <w:pPr>
+              <w:rPr/>
+            </w:pPr>
+            <w:r>
+              <w:rPr>
+                <w:sz w:val="18"/>
+                <w:szCs w:val="18"/>
+                <w:rtl w:val="0"/>
+              </w:rPr>
+              <w:t>WATCHLIST</w:t>
+            </w:r>
+          </w:p>
+        </w:tc>
+        <w:tc>
+          <w:tcPr/>
+          <w:p>
+            <w:pPr>
+              <w:rPr/>
+            </w:pPr>
+            <w:r>
+              <w:rPr>
+                <w:sz w:val="18"/>
+                <w:szCs w:val="18"/>
+                <w:rtl w:val="0"/>
+              </w:rPr>
+              <w:t>A pair watched by a Trader, with label, order and note; unique per Trader and pair.</w:t>
             </w:r>
           </w:p>
         </w:tc>
@@ -26020,54 +25817,39 @@
                 <w:szCs w:val="18"/>
                 <w:rtl w:val="0"/>
               </w:rPr>
-              <w:t xml:space="preserve">15</w:t>
-            </w:r>
-            <w:r>
-              <w:rPr>
-                <w:rtl w:val="0"/>
-              </w:rPr>
-            </w:r>
-          </w:p>
-        </w:tc>
-        <w:tc>
-          <w:tcPr/>
-          <w:p>
-            <w:pPr>
-              <w:rPr/>
-            </w:pPr>
-            <w:r>
-              <w:rPr>
-                <w:sz w:val="18"/>
-                <w:szCs w:val="18"/>
-                <w:rtl w:val="0"/>
-              </w:rPr>
-              <w:t xml:space="preserve">NOTIFICATION</w:t>
-            </w:r>
-            <w:r>
-              <w:rPr>
-                <w:rtl w:val="0"/>
-              </w:rPr>
-            </w:r>
-          </w:p>
-        </w:tc>
-        <w:tc>
-          <w:tcPr/>
-          <w:p>
-            <w:pPr>
-              <w:rPr/>
-            </w:pPr>
-            <w:r>
-              <w:rPr>
-                <w:sz w:val="18"/>
-                <w:szCs w:val="18"/>
-                <w:rtl w:val="0"/>
-              </w:rPr>
-              <w:t xml:space="preserve">Message to a user created by an alert or by trading, moderation, comment or subscription events, with read status.</w:t>
-            </w:r>
-            <w:r>
-              <w:rPr>
-                <w:rtl w:val="0"/>
-              </w:rPr>
+              <w:t>15</w:t>
+            </w:r>
+          </w:p>
+        </w:tc>
+        <w:tc>
+          <w:tcPr/>
+          <w:p>
+            <w:pPr>
+              <w:rPr/>
+            </w:pPr>
+            <w:r>
+              <w:rPr>
+                <w:sz w:val="18"/>
+                <w:szCs w:val="18"/>
+                <w:rtl w:val="0"/>
+              </w:rPr>
+              <w:t>ALERT</w:t>
+            </w:r>
+          </w:p>
+        </w:tc>
+        <w:tc>
+          <w:tcPr/>
+          <w:p>
+            <w:pPr>
+              <w:rPr/>
+            </w:pPr>
+            <w:r>
+              <w:rPr>
+                <w:sz w:val="18"/>
+                <w:szCs w:val="18"/>
+                <w:rtl w:val="0"/>
+              </w:rPr>
+              <w:t>Price or indicator alert rule on a watchlist pair with trigger mode, cooldown, channels, status and expiry.</w:t>
             </w:r>
           </w:p>
         </w:tc>
@@ -26090,54 +25872,39 @@
                 <w:szCs w:val="18"/>
                 <w:rtl w:val="0"/>
               </w:rPr>
-              <w:t xml:space="preserve">16</w:t>
-            </w:r>
-            <w:r>
-              <w:rPr>
-                <w:rtl w:val="0"/>
-              </w:rPr>
-            </w:r>
-          </w:p>
-        </w:tc>
-        <w:tc>
-          <w:tcPr/>
-          <w:p>
-            <w:pPr>
-              <w:rPr/>
-            </w:pPr>
-            <w:r>
-              <w:rPr>
-                <w:sz w:val="18"/>
-                <w:szCs w:val="18"/>
-                <w:rtl w:val="0"/>
-              </w:rPr>
-              <w:t xml:space="preserve">TRADING_STRATEGY</w:t>
-            </w:r>
-            <w:r>
-              <w:rPr>
-                <w:rtl w:val="0"/>
-              </w:rPr>
-            </w:r>
-          </w:p>
-        </w:tc>
-        <w:tc>
-          <w:tcPr/>
-          <w:p>
-            <w:pPr>
-              <w:rPr/>
-            </w:pPr>
-            <w:r>
-              <w:rPr>
-                <w:sz w:val="18"/>
-                <w:szCs w:val="18"/>
-                <w:rtl w:val="0"/>
-              </w:rPr>
-              <w:t xml:space="preserve">System-defined strategy category (e.g. Breakout, Swing, Scalping) used to classify trades.</w:t>
-            </w:r>
-            <w:r>
-              <w:rPr>
-                <w:rtl w:val="0"/>
-              </w:rPr>
+              <w:t>16</w:t>
+            </w:r>
+          </w:p>
+        </w:tc>
+        <w:tc>
+          <w:tcPr/>
+          <w:p>
+            <w:pPr>
+              <w:rPr/>
+            </w:pPr>
+            <w:r>
+              <w:rPr>
+                <w:sz w:val="18"/>
+                <w:szCs w:val="18"/>
+                <w:rtl w:val="0"/>
+              </w:rPr>
+              <w:t>NOTIFICATION</w:t>
+            </w:r>
+          </w:p>
+        </w:tc>
+        <w:tc>
+          <w:tcPr/>
+          <w:p>
+            <w:pPr>
+              <w:rPr/>
+            </w:pPr>
+            <w:r>
+              <w:rPr>
+                <w:sz w:val="18"/>
+                <w:szCs w:val="18"/>
+                <w:rtl w:val="0"/>
+              </w:rPr>
+              <w:t>Message to a user created by an alert or by trading, moderation, comment or subscription events, with read status.</w:t>
             </w:r>
           </w:p>
         </w:tc>
@@ -26160,54 +25927,39 @@
                 <w:szCs w:val="18"/>
                 <w:rtl w:val="0"/>
               </w:rPr>
-              <w:t xml:space="preserve">17</w:t>
-            </w:r>
-            <w:r>
-              <w:rPr>
-                <w:rtl w:val="0"/>
-              </w:rPr>
-            </w:r>
-          </w:p>
-        </w:tc>
-        <w:tc>
-          <w:tcPr/>
-          <w:p>
-            <w:pPr>
-              <w:rPr/>
-            </w:pPr>
-            <w:r>
-              <w:rPr>
-                <w:sz w:val="18"/>
-                <w:szCs w:val="18"/>
-                <w:rtl w:val="0"/>
-              </w:rPr>
-              <w:t xml:space="preserve">TRADING_PLAN</w:t>
-            </w:r>
-            <w:r>
-              <w:rPr>
-                <w:rtl w:val="0"/>
-              </w:rPr>
-            </w:r>
-          </w:p>
-        </w:tc>
-        <w:tc>
-          <w:tcPr/>
-          <w:p>
-            <w:pPr>
-              <w:rPr/>
-            </w:pPr>
-            <w:r>
-              <w:rPr>
-                <w:sz w:val="18"/>
-                <w:szCs w:val="18"/>
-                <w:rtl w:val="0"/>
-              </w:rPr>
-              <w:t xml:space="preserve">Trader's plan: pair, market, direction, entry, stop loss, take profit, capital, risk %, leverage, calculation snapshot and status.</w:t>
-            </w:r>
-            <w:r>
-              <w:rPr>
-                <w:rtl w:val="0"/>
-              </w:rPr>
+              <w:t>17</w:t>
+            </w:r>
+          </w:p>
+        </w:tc>
+        <w:tc>
+          <w:tcPr/>
+          <w:p>
+            <w:pPr>
+              <w:rPr/>
+            </w:pPr>
+            <w:r>
+              <w:rPr>
+                <w:sz w:val="18"/>
+                <w:szCs w:val="18"/>
+                <w:rtl w:val="0"/>
+              </w:rPr>
+              <w:t>TRADING_STRATEGY</w:t>
+            </w:r>
+          </w:p>
+        </w:tc>
+        <w:tc>
+          <w:tcPr/>
+          <w:p>
+            <w:pPr>
+              <w:rPr/>
+            </w:pPr>
+            <w:r>
+              <w:rPr>
+                <w:sz w:val="18"/>
+                <w:szCs w:val="18"/>
+                <w:rtl w:val="0"/>
+              </w:rPr>
+              <w:t>System-defined strategy category (e.g. Breakout, Swing, Scalping) used to classify trades.</w:t>
             </w:r>
           </w:p>
         </w:tc>
@@ -26230,54 +25982,39 @@
                 <w:szCs w:val="18"/>
                 <w:rtl w:val="0"/>
               </w:rPr>
-              <w:t xml:space="preserve">18</w:t>
-            </w:r>
-            <w:r>
-              <w:rPr>
-                <w:rtl w:val="0"/>
-              </w:rPr>
-            </w:r>
-          </w:p>
-        </w:tc>
-        <w:tc>
-          <w:tcPr/>
-          <w:p>
-            <w:pPr>
-              <w:rPr/>
-            </w:pPr>
-            <w:r>
-              <w:rPr>
-                <w:sz w:val="18"/>
-                <w:szCs w:val="18"/>
-                <w:rtl w:val="0"/>
-              </w:rPr>
-              <w:t xml:space="preserve">TRADING_PLAN_WARNING</w:t>
-            </w:r>
-            <w:r>
-              <w:rPr>
-                <w:rtl w:val="0"/>
-              </w:rPr>
-            </w:r>
-          </w:p>
-        </w:tc>
-        <w:tc>
-          <w:tcPr/>
-          <w:p>
-            <w:pPr>
-              <w:rPr/>
-            </w:pPr>
-            <w:r>
-              <w:rPr>
-                <w:sz w:val="18"/>
-                <w:szCs w:val="18"/>
-                <w:rtl w:val="0"/>
-              </w:rPr>
-              <w:t xml:space="preserve">Risk warning raised for a plan with type and severity (INFO, WARNING, BLOCKING).</w:t>
-            </w:r>
-            <w:r>
-              <w:rPr>
-                <w:rtl w:val="0"/>
-              </w:rPr>
+              <w:t>18</w:t>
+            </w:r>
+          </w:p>
+        </w:tc>
+        <w:tc>
+          <w:tcPr/>
+          <w:p>
+            <w:pPr>
+              <w:rPr/>
+            </w:pPr>
+            <w:r>
+              <w:rPr>
+                <w:sz w:val="18"/>
+                <w:szCs w:val="18"/>
+                <w:rtl w:val="0"/>
+              </w:rPr>
+              <w:t>TRADING_PLAN</w:t>
+            </w:r>
+          </w:p>
+        </w:tc>
+        <w:tc>
+          <w:tcPr/>
+          <w:p>
+            <w:pPr>
+              <w:rPr/>
+            </w:pPr>
+            <w:r>
+              <w:rPr>
+                <w:sz w:val="18"/>
+                <w:szCs w:val="18"/>
+                <w:rtl w:val="0"/>
+              </w:rPr>
+              <w:t>Trader's plan: pair, market, direction, entry, stop loss, take profit, capital, risk %, leverage, calculation snapshot and status.</w:t>
             </w:r>
           </w:p>
         </w:tc>
@@ -26300,54 +26037,39 @@
                 <w:szCs w:val="18"/>
                 <w:rtl w:val="0"/>
               </w:rPr>
-              <w:t xml:space="preserve">19</w:t>
-            </w:r>
-            <w:r>
-              <w:rPr>
-                <w:rtl w:val="0"/>
-              </w:rPr>
-            </w:r>
-          </w:p>
-        </w:tc>
-        <w:tc>
-          <w:tcPr/>
-          <w:p>
-            <w:pPr>
-              <w:rPr/>
-            </w:pPr>
-            <w:r>
-              <w:rPr>
-                <w:sz w:val="18"/>
-                <w:szCs w:val="18"/>
-                <w:rtl w:val="0"/>
-              </w:rPr>
-              <w:t xml:space="preserve">TRADING_JOURNAL</w:t>
-            </w:r>
-            <w:r>
-              <w:rPr>
-                <w:rtl w:val="0"/>
-              </w:rPr>
-            </w:r>
-          </w:p>
-        </w:tc>
-        <w:tc>
-          <w:tcPr/>
-          <w:p>
-            <w:pPr>
-              <w:rPr/>
-            </w:pPr>
-            <w:r>
-              <w:rPr>
-                <w:sz w:val="18"/>
-                <w:szCs w:val="18"/>
-                <w:rtl w:val="0"/>
-              </w:rPr>
-              <w:t xml:space="preserve">Record of a simulated or manual trade: execution facts, fees, funding, realized profit/loss (BR-35; net profit/loss is derived, BR-38) and the Trader's review.</w:t>
-            </w:r>
-            <w:r>
-              <w:rPr>
-                <w:rtl w:val="0"/>
-              </w:rPr>
+              <w:t>19</w:t>
+            </w:r>
+          </w:p>
+        </w:tc>
+        <w:tc>
+          <w:tcPr/>
+          <w:p>
+            <w:pPr>
+              <w:rPr/>
+            </w:pPr>
+            <w:r>
+              <w:rPr>
+                <w:sz w:val="18"/>
+                <w:szCs w:val="18"/>
+                <w:rtl w:val="0"/>
+              </w:rPr>
+              <w:t>TRADING_PLAN_WARNING</w:t>
+            </w:r>
+          </w:p>
+        </w:tc>
+        <w:tc>
+          <w:tcPr/>
+          <w:p>
+            <w:pPr>
+              <w:rPr/>
+            </w:pPr>
+            <w:r>
+              <w:rPr>
+                <w:sz w:val="18"/>
+                <w:szCs w:val="18"/>
+                <w:rtl w:val="0"/>
+              </w:rPr>
+              <w:t>Risk warning raised for a plan with type and severity (INFO, WARNING, BLOCKING).</w:t>
             </w:r>
           </w:p>
         </w:tc>
@@ -26370,54 +26092,39 @@
                 <w:szCs w:val="18"/>
                 <w:rtl w:val="0"/>
               </w:rPr>
-              <w:t xml:space="preserve">20</w:t>
-            </w:r>
-            <w:r>
-              <w:rPr>
-                <w:rtl w:val="0"/>
-              </w:rPr>
-            </w:r>
-          </w:p>
-        </w:tc>
-        <w:tc>
-          <w:tcPr/>
-          <w:p>
-            <w:pPr>
-              <w:rPr/>
-            </w:pPr>
-            <w:r>
-              <w:rPr>
-                <w:sz w:val="18"/>
-                <w:szCs w:val="18"/>
-                <w:rtl w:val="0"/>
-              </w:rPr>
-              <w:t xml:space="preserve">FORUM_POST</w:t>
-            </w:r>
-            <w:r>
-              <w:rPr>
-                <w:rtl w:val="0"/>
-              </w:rPr>
-            </w:r>
-          </w:p>
-        </w:tc>
-        <w:tc>
-          <w:tcPr/>
-          <w:p>
-            <w:pPr>
-              <w:rPr/>
-            </w:pPr>
-            <w:r>
-              <w:rPr>
-                <w:sz w:val="18"/>
-                <w:szCs w:val="18"/>
-                <w:rtl w:val="0"/>
-              </w:rPr>
-              <w:t xml:space="preserve">Community post (text or video) with market type, status, official flag and, for official posts, the category (ANNOUNCEMENT, PLATFORM_UPDATE, EDUCATION).</w:t>
-            </w:r>
-            <w:r>
-              <w:rPr>
-                <w:rtl w:val="0"/>
-              </w:rPr>
+              <w:t>20</w:t>
+            </w:r>
+          </w:p>
+        </w:tc>
+        <w:tc>
+          <w:tcPr/>
+          <w:p>
+            <w:pPr>
+              <w:rPr/>
+            </w:pPr>
+            <w:r>
+              <w:rPr>
+                <w:sz w:val="18"/>
+                <w:szCs w:val="18"/>
+                <w:rtl w:val="0"/>
+              </w:rPr>
+              <w:t>TRADING_JOURNAL</w:t>
+            </w:r>
+          </w:p>
+        </w:tc>
+        <w:tc>
+          <w:tcPr/>
+          <w:p>
+            <w:pPr>
+              <w:rPr/>
+            </w:pPr>
+            <w:r>
+              <w:rPr>
+                <w:sz w:val="18"/>
+                <w:szCs w:val="18"/>
+                <w:rtl w:val="0"/>
+              </w:rPr>
+              <w:t>Record of a simulated or manual trade: execution facts, fees, funding, realized profit/loss (BR-35; net profit/loss is derived, BR-38) and the Trader's review.</w:t>
             </w:r>
           </w:p>
         </w:tc>
@@ -26440,54 +26147,39 @@
                 <w:szCs w:val="18"/>
                 <w:rtl w:val="0"/>
               </w:rPr>
-              <w:t xml:space="preserve">21</w:t>
-            </w:r>
-            <w:r>
-              <w:rPr>
-                <w:rtl w:val="0"/>
-              </w:rPr>
-            </w:r>
-          </w:p>
-        </w:tc>
-        <w:tc>
-          <w:tcPr/>
-          <w:p>
-            <w:pPr>
-              <w:rPr/>
-            </w:pPr>
-            <w:r>
-              <w:rPr>
-                <w:sz w:val="18"/>
-                <w:szCs w:val="18"/>
-                <w:rtl w:val="0"/>
-              </w:rPr>
-              <w:t xml:space="preserve">POST_COIN</w:t>
-            </w:r>
-            <w:r>
-              <w:rPr>
-                <w:rtl w:val="0"/>
-              </w:rPr>
-            </w:r>
-          </w:p>
-        </w:tc>
-        <w:tc>
-          <w:tcPr/>
-          <w:p>
-            <w:pPr>
-              <w:rPr/>
-            </w:pPr>
-            <w:r>
-              <w:rPr>
-                <w:sz w:val="18"/>
-                <w:szCs w:val="18"/>
-                <w:rtl w:val="0"/>
-              </w:rPr>
-              <w:t xml:space="preserve">Association between posts and the coins they are tagged with.</w:t>
-            </w:r>
-            <w:r>
-              <w:rPr>
-                <w:rtl w:val="0"/>
-              </w:rPr>
+              <w:t>21</w:t>
+            </w:r>
+          </w:p>
+        </w:tc>
+        <w:tc>
+          <w:tcPr/>
+          <w:p>
+            <w:pPr>
+              <w:rPr/>
+            </w:pPr>
+            <w:r>
+              <w:rPr>
+                <w:sz w:val="18"/>
+                <w:szCs w:val="18"/>
+                <w:rtl w:val="0"/>
+              </w:rPr>
+              <w:t>TRADING_JOURNAL_LEVEL_CHANGE</w:t>
+            </w:r>
+          </w:p>
+        </w:tc>
+        <w:tc>
+          <w:tcPr/>
+          <w:p>
+            <w:pPr>
+              <w:rPr/>
+            </w:pPr>
+            <w:r>
+              <w:rPr>
+                <w:sz w:val="18"/>
+                <w:szCs w:val="18"/>
+                <w:rtl w:val="0"/>
+              </w:rPr>
+              <w:t>Change of the stop loss or take profit of an open simulated position, with the old and new values and the time.</w:t>
             </w:r>
           </w:p>
         </w:tc>
@@ -26510,54 +26202,39 @@
                 <w:szCs w:val="18"/>
                 <w:rtl w:val="0"/>
               </w:rPr>
-              <w:t xml:space="preserve">22</w:t>
-            </w:r>
-            <w:r>
-              <w:rPr>
-                <w:rtl w:val="0"/>
-              </w:rPr>
-            </w:r>
-          </w:p>
-        </w:tc>
-        <w:tc>
-          <w:tcPr/>
-          <w:p>
-            <w:pPr>
-              <w:rPr/>
-            </w:pPr>
-            <w:r>
-              <w:rPr>
-                <w:sz w:val="18"/>
-                <w:szCs w:val="18"/>
-                <w:rtl w:val="0"/>
-              </w:rPr>
-              <w:t xml:space="preserve">FORUM_COMMENT</w:t>
-            </w:r>
-            <w:r>
-              <w:rPr>
-                <w:rtl w:val="0"/>
-              </w:rPr>
-            </w:r>
-          </w:p>
-        </w:tc>
-        <w:tc>
-          <w:tcPr/>
-          <w:p>
-            <w:pPr>
-              <w:rPr/>
-            </w:pPr>
-            <w:r>
-              <w:rPr>
-                <w:sz w:val="18"/>
-                <w:szCs w:val="18"/>
-                <w:rtl w:val="0"/>
-              </w:rPr>
-              <w:t xml:space="preserve">Comment on a post; may reply to another comment.</w:t>
-            </w:r>
-            <w:r>
-              <w:rPr>
-                <w:rtl w:val="0"/>
-              </w:rPr>
+              <w:t>22</w:t>
+            </w:r>
+          </w:p>
+        </w:tc>
+        <w:tc>
+          <w:tcPr/>
+          <w:p>
+            <w:pPr>
+              <w:rPr/>
+            </w:pPr>
+            <w:r>
+              <w:rPr>
+                <w:sz w:val="18"/>
+                <w:szCs w:val="18"/>
+                <w:rtl w:val="0"/>
+              </w:rPr>
+              <w:t>FORUM_POST</w:t>
+            </w:r>
+          </w:p>
+        </w:tc>
+        <w:tc>
+          <w:tcPr/>
+          <w:p>
+            <w:pPr>
+              <w:rPr/>
+            </w:pPr>
+            <w:r>
+              <w:rPr>
+                <w:sz w:val="18"/>
+                <w:szCs w:val="18"/>
+                <w:rtl w:val="0"/>
+              </w:rPr>
+              <w:t>Community post (text or video) with market type, status, official flag and, for official posts, the category (ANNOUNCEMENT, PLATFORM_UPDATE, EDUCATION).</w:t>
             </w:r>
           </w:p>
         </w:tc>
@@ -26580,54 +26257,39 @@
                 <w:szCs w:val="18"/>
                 <w:rtl w:val="0"/>
               </w:rPr>
-              <w:t xml:space="preserve">23</w:t>
-            </w:r>
-            <w:r>
-              <w:rPr>
-                <w:rtl w:val="0"/>
-              </w:rPr>
-            </w:r>
-          </w:p>
-        </w:tc>
-        <w:tc>
-          <w:tcPr/>
-          <w:p>
-            <w:pPr>
-              <w:rPr/>
-            </w:pPr>
-            <w:r>
-              <w:rPr>
-                <w:sz w:val="18"/>
-                <w:szCs w:val="18"/>
-                <w:rtl w:val="0"/>
-              </w:rPr>
-              <w:t xml:space="preserve">ENGAGEMENT</w:t>
-            </w:r>
-            <w:r>
-              <w:rPr>
-                <w:rtl w:val="0"/>
-              </w:rPr>
-            </w:r>
-          </w:p>
-        </w:tc>
-        <w:tc>
-          <w:tcPr/>
-          <w:p>
-            <w:pPr>
-              <w:rPr/>
-            </w:pPr>
-            <w:r>
-              <w:rPr>
-                <w:sz w:val="18"/>
-                <w:szCs w:val="18"/>
-                <w:rtl w:val="0"/>
-              </w:rPr>
-              <w:t xml:space="preserve">Like or save action of a user on exactly one post or comment.</w:t>
-            </w:r>
-            <w:r>
-              <w:rPr>
-                <w:rtl w:val="0"/>
-              </w:rPr>
+              <w:t>23</w:t>
+            </w:r>
+          </w:p>
+        </w:tc>
+        <w:tc>
+          <w:tcPr/>
+          <w:p>
+            <w:pPr>
+              <w:rPr/>
+            </w:pPr>
+            <w:r>
+              <w:rPr>
+                <w:sz w:val="18"/>
+                <w:szCs w:val="18"/>
+                <w:rtl w:val="0"/>
+              </w:rPr>
+              <w:t>POST_COIN</w:t>
+            </w:r>
+          </w:p>
+        </w:tc>
+        <w:tc>
+          <w:tcPr/>
+          <w:p>
+            <w:pPr>
+              <w:rPr/>
+            </w:pPr>
+            <w:r>
+              <w:rPr>
+                <w:sz w:val="18"/>
+                <w:szCs w:val="18"/>
+                <w:rtl w:val="0"/>
+              </w:rPr>
+              <w:t>Association between posts and the coins they are tagged with.</w:t>
             </w:r>
           </w:p>
         </w:tc>
@@ -26650,54 +26312,39 @@
                 <w:szCs w:val="18"/>
                 <w:rtl w:val="0"/>
               </w:rPr>
-              <w:t xml:space="preserve">24</w:t>
-            </w:r>
-            <w:r>
-              <w:rPr>
-                <w:rtl w:val="0"/>
-              </w:rPr>
-            </w:r>
-          </w:p>
-        </w:tc>
-        <w:tc>
-          <w:tcPr/>
-          <w:p>
-            <w:pPr>
-              <w:rPr/>
-            </w:pPr>
-            <w:r>
-              <w:rPr>
-                <w:sz w:val="18"/>
-                <w:szCs w:val="18"/>
-                <w:rtl w:val="0"/>
-              </w:rPr>
-              <w:t xml:space="preserve">POST_MEDIA</w:t>
-            </w:r>
-            <w:r>
-              <w:rPr>
-                <w:rtl w:val="0"/>
-              </w:rPr>
-            </w:r>
-          </w:p>
-        </w:tc>
-        <w:tc>
-          <w:tcPr/>
-          <w:p>
-            <w:pPr>
-              <w:rPr/>
-            </w:pPr>
-            <w:r>
-              <w:rPr>
-                <w:sz w:val="18"/>
-                <w:szCs w:val="18"/>
-                <w:rtl w:val="0"/>
-              </w:rPr>
-              <w:t xml:space="preserve">Image or video attached to a post, stored in Media Storage.</w:t>
-            </w:r>
-            <w:r>
-              <w:rPr>
-                <w:rtl w:val="0"/>
-              </w:rPr>
+              <w:t>24</w:t>
+            </w:r>
+          </w:p>
+        </w:tc>
+        <w:tc>
+          <w:tcPr/>
+          <w:p>
+            <w:pPr>
+              <w:rPr/>
+            </w:pPr>
+            <w:r>
+              <w:rPr>
+                <w:sz w:val="18"/>
+                <w:szCs w:val="18"/>
+                <w:rtl w:val="0"/>
+              </w:rPr>
+              <w:t>FORUM_COMMENT</w:t>
+            </w:r>
+          </w:p>
+        </w:tc>
+        <w:tc>
+          <w:tcPr/>
+          <w:p>
+            <w:pPr>
+              <w:rPr/>
+            </w:pPr>
+            <w:r>
+              <w:rPr>
+                <w:sz w:val="18"/>
+                <w:szCs w:val="18"/>
+                <w:rtl w:val="0"/>
+              </w:rPr>
+              <w:t>Comment on a post; may reply to another comment.</w:t>
             </w:r>
           </w:p>
         </w:tc>
@@ -26720,54 +26367,39 @@
                 <w:szCs w:val="18"/>
                 <w:rtl w:val="0"/>
               </w:rPr>
-              <w:t xml:space="preserve">25</w:t>
-            </w:r>
-            <w:r>
-              <w:rPr>
-                <w:rtl w:val="0"/>
-              </w:rPr>
-            </w:r>
-          </w:p>
-        </w:tc>
-        <w:tc>
-          <w:tcPr/>
-          <w:p>
-            <w:pPr>
-              <w:rPr/>
-            </w:pPr>
-            <w:r>
-              <w:rPr>
-                <w:sz w:val="18"/>
-                <w:szCs w:val="18"/>
-                <w:rtl w:val="0"/>
-              </w:rPr>
-              <w:t xml:space="preserve">POST_REPORT</w:t>
-            </w:r>
-            <w:r>
-              <w:rPr>
-                <w:rtl w:val="0"/>
-              </w:rPr>
-            </w:r>
-          </w:p>
-        </w:tc>
-        <w:tc>
-          <w:tcPr/>
-          <w:p>
-            <w:pPr>
-              <w:rPr/>
-            </w:pPr>
-            <w:r>
-              <w:rPr>
-                <w:sz w:val="18"/>
-                <w:szCs w:val="18"/>
-                <w:rtl w:val="0"/>
-              </w:rPr>
-              <w:t xml:space="preserve">Violation report on a post, with reason, status and the Admin's resolution.</w:t>
-            </w:r>
-            <w:r>
-              <w:rPr>
-                <w:rtl w:val="0"/>
-              </w:rPr>
+              <w:t>25</w:t>
+            </w:r>
+          </w:p>
+        </w:tc>
+        <w:tc>
+          <w:tcPr/>
+          <w:p>
+            <w:pPr>
+              <w:rPr/>
+            </w:pPr>
+            <w:r>
+              <w:rPr>
+                <w:sz w:val="18"/>
+                <w:szCs w:val="18"/>
+                <w:rtl w:val="0"/>
+              </w:rPr>
+              <w:t>ENGAGEMENT</w:t>
+            </w:r>
+          </w:p>
+        </w:tc>
+        <w:tc>
+          <w:tcPr/>
+          <w:p>
+            <w:pPr>
+              <w:rPr/>
+            </w:pPr>
+            <w:r>
+              <w:rPr>
+                <w:sz w:val="18"/>
+                <w:szCs w:val="18"/>
+                <w:rtl w:val="0"/>
+              </w:rPr>
+              <w:t>Like or save action of a user on exactly one post or comment; on a post also a view or a Bullish or Bearish vote.</w:t>
             </w:r>
           </w:p>
         </w:tc>
@@ -26790,54 +26422,39 @@
                 <w:szCs w:val="18"/>
                 <w:rtl w:val="0"/>
               </w:rPr>
-              <w:t xml:space="preserve">26</w:t>
-            </w:r>
-            <w:r>
-              <w:rPr>
-                <w:rtl w:val="0"/>
-              </w:rPr>
-            </w:r>
-          </w:p>
-        </w:tc>
-        <w:tc>
-          <w:tcPr/>
-          <w:p>
-            <w:pPr>
-              <w:rPr/>
-            </w:pPr>
-            <w:r>
-              <w:rPr>
-                <w:sz w:val="18"/>
-                <w:szCs w:val="18"/>
-                <w:rtl w:val="0"/>
-              </w:rPr>
-              <w:t xml:space="preserve">NEWS_SOURCE</w:t>
-            </w:r>
-            <w:r>
-              <w:rPr>
-                <w:rtl w:val="0"/>
-              </w:rPr>
-            </w:r>
-          </w:p>
-        </w:tc>
-        <w:tc>
-          <w:tcPr/>
-          <w:p>
-            <w:pPr>
-              <w:rPr/>
-            </w:pPr>
-            <w:r>
-              <w:rPr>
-                <w:sz w:val="18"/>
-                <w:szCs w:val="18"/>
-                <w:rtl w:val="0"/>
-              </w:rPr>
-              <w:t xml:space="preserve">RSS source managed by Admin with crawl interval and status.</w:t>
-            </w:r>
-            <w:r>
-              <w:rPr>
-                <w:rtl w:val="0"/>
-              </w:rPr>
+              <w:t>26</w:t>
+            </w:r>
+          </w:p>
+        </w:tc>
+        <w:tc>
+          <w:tcPr/>
+          <w:p>
+            <w:pPr>
+              <w:rPr/>
+            </w:pPr>
+            <w:r>
+              <w:rPr>
+                <w:sz w:val="18"/>
+                <w:szCs w:val="18"/>
+                <w:rtl w:val="0"/>
+              </w:rPr>
+              <w:t>POST_MEDIA</w:t>
+            </w:r>
+          </w:p>
+        </w:tc>
+        <w:tc>
+          <w:tcPr/>
+          <w:p>
+            <w:pPr>
+              <w:rPr/>
+            </w:pPr>
+            <w:r>
+              <w:rPr>
+                <w:sz w:val="18"/>
+                <w:szCs w:val="18"/>
+                <w:rtl w:val="0"/>
+              </w:rPr>
+              <w:t>Image or video attached to a post, stored in Media Storage.</w:t>
             </w:r>
           </w:p>
         </w:tc>
@@ -26860,54 +26477,39 @@
                 <w:szCs w:val="18"/>
                 <w:rtl w:val="0"/>
               </w:rPr>
-              <w:t xml:space="preserve">27</w:t>
-            </w:r>
-            <w:r>
-              <w:rPr>
-                <w:rtl w:val="0"/>
-              </w:rPr>
-            </w:r>
-          </w:p>
-        </w:tc>
-        <w:tc>
-          <w:tcPr/>
-          <w:p>
-            <w:pPr>
-              <w:rPr/>
-            </w:pPr>
-            <w:r>
-              <w:rPr>
-                <w:sz w:val="18"/>
-                <w:szCs w:val="18"/>
-                <w:rtl w:val="0"/>
-              </w:rPr>
-              <w:t xml:space="preserve">NEWS_CRAWL_LOG</w:t>
-            </w:r>
-            <w:r>
-              <w:rPr>
-                <w:rtl w:val="0"/>
-              </w:rPr>
-            </w:r>
-          </w:p>
-        </w:tc>
-        <w:tc>
-          <w:tcPr/>
-          <w:p>
-            <w:pPr>
-              <w:rPr/>
-            </w:pPr>
-            <w:r>
-              <w:rPr>
-                <w:sz w:val="18"/>
-                <w:szCs w:val="18"/>
-                <w:rtl w:val="0"/>
-              </w:rPr>
-              <w:t xml:space="preserve">Result of one crawl of a source: time, status, articles found and inserted, error.</w:t>
-            </w:r>
-            <w:r>
-              <w:rPr>
-                <w:rtl w:val="0"/>
-              </w:rPr>
+              <w:t>27</w:t>
+            </w:r>
+          </w:p>
+        </w:tc>
+        <w:tc>
+          <w:tcPr/>
+          <w:p>
+            <w:pPr>
+              <w:rPr/>
+            </w:pPr>
+            <w:r>
+              <w:rPr>
+                <w:sz w:val="18"/>
+                <w:szCs w:val="18"/>
+                <w:rtl w:val="0"/>
+              </w:rPr>
+              <w:t>POST_REPORT</w:t>
+            </w:r>
+          </w:p>
+        </w:tc>
+        <w:tc>
+          <w:tcPr/>
+          <w:p>
+            <w:pPr>
+              <w:rPr/>
+            </w:pPr>
+            <w:r>
+              <w:rPr>
+                <w:sz w:val="18"/>
+                <w:szCs w:val="18"/>
+                <w:rtl w:val="0"/>
+              </w:rPr>
+              <w:t>Violation report on a post or a comment, with reason, status and the Admin's resolution.</w:t>
             </w:r>
           </w:p>
         </w:tc>
@@ -26930,54 +26532,39 @@
                 <w:szCs w:val="18"/>
                 <w:rtl w:val="0"/>
               </w:rPr>
-              <w:t xml:space="preserve">28</w:t>
-            </w:r>
-            <w:r>
-              <w:rPr>
-                <w:rtl w:val="0"/>
-              </w:rPr>
-            </w:r>
-          </w:p>
-        </w:tc>
-        <w:tc>
-          <w:tcPr/>
-          <w:p>
-            <w:pPr>
-              <w:rPr/>
-            </w:pPr>
-            <w:r>
-              <w:rPr>
-                <w:sz w:val="18"/>
-                <w:szCs w:val="18"/>
-                <w:rtl w:val="0"/>
-              </w:rPr>
-              <w:t xml:space="preserve">NEWS_ARTICLE</w:t>
-            </w:r>
-            <w:r>
-              <w:rPr>
-                <w:rtl w:val="0"/>
-              </w:rPr>
-            </w:r>
-          </w:p>
-        </w:tc>
-        <w:tc>
-          <w:tcPr/>
-          <w:p>
-            <w:pPr>
-              <w:rPr/>
-            </w:pPr>
-            <w:r>
-              <w:rPr>
-                <w:sz w:val="18"/>
-                <w:szCs w:val="18"/>
-                <w:rtl w:val="0"/>
-              </w:rPr>
-              <w:t xml:space="preserve">Collected article: title, original URL, excerpt, AI summary, sentiment, publish time.</w:t>
-            </w:r>
-            <w:r>
-              <w:rPr>
-                <w:rtl w:val="0"/>
-              </w:rPr>
+              <w:t>28</w:t>
+            </w:r>
+          </w:p>
+        </w:tc>
+        <w:tc>
+          <w:tcPr/>
+          <w:p>
+            <w:pPr>
+              <w:rPr/>
+            </w:pPr>
+            <w:r>
+              <w:rPr>
+                <w:sz w:val="18"/>
+                <w:szCs w:val="18"/>
+                <w:rtl w:val="0"/>
+              </w:rPr>
+              <w:t>NEWS_SOURCE</w:t>
+            </w:r>
+          </w:p>
+        </w:tc>
+        <w:tc>
+          <w:tcPr/>
+          <w:p>
+            <w:pPr>
+              <w:rPr/>
+            </w:pPr>
+            <w:r>
+              <w:rPr>
+                <w:sz w:val="18"/>
+                <w:szCs w:val="18"/>
+                <w:rtl w:val="0"/>
+              </w:rPr>
+              <w:t>RSS source managed by Admin with crawl interval and status.</w:t>
             </w:r>
           </w:p>
         </w:tc>
@@ -27000,54 +26587,39 @@
                 <w:szCs w:val="18"/>
                 <w:rtl w:val="0"/>
               </w:rPr>
-              <w:t xml:space="preserve">29</w:t>
-            </w:r>
-            <w:r>
-              <w:rPr>
-                <w:rtl w:val="0"/>
-              </w:rPr>
-            </w:r>
-          </w:p>
-        </w:tc>
-        <w:tc>
-          <w:tcPr/>
-          <w:p>
-            <w:pPr>
-              <w:rPr/>
-            </w:pPr>
-            <w:r>
-              <w:rPr>
-                <w:sz w:val="18"/>
-                <w:szCs w:val="18"/>
-                <w:rtl w:val="0"/>
-              </w:rPr>
-              <w:t xml:space="preserve">NEWS_TAG</w:t>
-            </w:r>
-            <w:r>
-              <w:rPr>
-                <w:rtl w:val="0"/>
-              </w:rPr>
-            </w:r>
-          </w:p>
-        </w:tc>
-        <w:tc>
-          <w:tcPr/>
-          <w:p>
-            <w:pPr>
-              <w:rPr/>
-            </w:pPr>
-            <w:r>
-              <w:rPr>
-                <w:sz w:val="18"/>
-                <w:szCs w:val="18"/>
-                <w:rtl w:val="0"/>
-              </w:rPr>
-              <w:t xml:space="preserve">Topic tag of news articles.</w:t>
-            </w:r>
-            <w:r>
-              <w:rPr>
-                <w:rtl w:val="0"/>
-              </w:rPr>
+              <w:t>29</w:t>
+            </w:r>
+          </w:p>
+        </w:tc>
+        <w:tc>
+          <w:tcPr/>
+          <w:p>
+            <w:pPr>
+              <w:rPr/>
+            </w:pPr>
+            <w:r>
+              <w:rPr>
+                <w:sz w:val="18"/>
+                <w:szCs w:val="18"/>
+                <w:rtl w:val="0"/>
+              </w:rPr>
+              <w:t>NEWS_CRAWL_LOG</w:t>
+            </w:r>
+          </w:p>
+        </w:tc>
+        <w:tc>
+          <w:tcPr/>
+          <w:p>
+            <w:pPr>
+              <w:rPr/>
+            </w:pPr>
+            <w:r>
+              <w:rPr>
+                <w:sz w:val="18"/>
+                <w:szCs w:val="18"/>
+                <w:rtl w:val="0"/>
+              </w:rPr>
+              <w:t>Result of one crawl of a source: time, status, articles found and inserted, error.</w:t>
             </w:r>
           </w:p>
         </w:tc>
@@ -27070,54 +26642,39 @@
                 <w:szCs w:val="18"/>
                 <w:rtl w:val="0"/>
               </w:rPr>
-              <w:t xml:space="preserve">30</w:t>
-            </w:r>
-            <w:r>
-              <w:rPr>
-                <w:rtl w:val="0"/>
-              </w:rPr>
-            </w:r>
-          </w:p>
-        </w:tc>
-        <w:tc>
-          <w:tcPr/>
-          <w:p>
-            <w:pPr>
-              <w:rPr/>
-            </w:pPr>
-            <w:r>
-              <w:rPr>
-                <w:sz w:val="18"/>
-                <w:szCs w:val="18"/>
-                <w:rtl w:val="0"/>
-              </w:rPr>
-              <w:t xml:space="preserve">NEWS_ARTICLE_TAG</w:t>
-            </w:r>
-            <w:r>
-              <w:rPr>
-                <w:rtl w:val="0"/>
-              </w:rPr>
-            </w:r>
-          </w:p>
-        </w:tc>
-        <w:tc>
-          <w:tcPr/>
-          <w:p>
-            <w:pPr>
-              <w:rPr/>
-            </w:pPr>
-            <w:r>
-              <w:rPr>
-                <w:sz w:val="18"/>
-                <w:szCs w:val="18"/>
-                <w:rtl w:val="0"/>
-              </w:rPr>
-              <w:t xml:space="preserve">Association between articles and topic tags.</w:t>
-            </w:r>
-            <w:r>
-              <w:rPr>
-                <w:rtl w:val="0"/>
-              </w:rPr>
+              <w:t>30</w:t>
+            </w:r>
+          </w:p>
+        </w:tc>
+        <w:tc>
+          <w:tcPr/>
+          <w:p>
+            <w:pPr>
+              <w:rPr/>
+            </w:pPr>
+            <w:r>
+              <w:rPr>
+                <w:sz w:val="18"/>
+                <w:szCs w:val="18"/>
+                <w:rtl w:val="0"/>
+              </w:rPr>
+              <w:t>NEWS_ARTICLE</w:t>
+            </w:r>
+          </w:p>
+        </w:tc>
+        <w:tc>
+          <w:tcPr/>
+          <w:p>
+            <w:pPr>
+              <w:rPr/>
+            </w:pPr>
+            <w:r>
+              <w:rPr>
+                <w:sz w:val="18"/>
+                <w:szCs w:val="18"/>
+                <w:rtl w:val="0"/>
+              </w:rPr>
+              <w:t>Collected article: title, original URL, excerpt, AI summary, sentiment, publish time.</w:t>
             </w:r>
           </w:p>
         </w:tc>
@@ -27140,54 +26697,39 @@
                 <w:szCs w:val="18"/>
                 <w:rtl w:val="0"/>
               </w:rPr>
-              <w:t xml:space="preserve">31</w:t>
-            </w:r>
-            <w:r>
-              <w:rPr>
-                <w:rtl w:val="0"/>
-              </w:rPr>
-            </w:r>
-          </w:p>
-        </w:tc>
-        <w:tc>
-          <w:tcPr/>
-          <w:p>
-            <w:pPr>
-              <w:rPr/>
-            </w:pPr>
-            <w:r>
-              <w:rPr>
-                <w:sz w:val="18"/>
-                <w:szCs w:val="18"/>
-                <w:rtl w:val="0"/>
-              </w:rPr>
-              <w:t xml:space="preserve">NEWS_ARTICLE_COIN</w:t>
-            </w:r>
-            <w:r>
-              <w:rPr>
-                <w:rtl w:val="0"/>
-              </w:rPr>
-            </w:r>
-          </w:p>
-        </w:tc>
-        <w:tc>
-          <w:tcPr/>
-          <w:p>
-            <w:pPr>
-              <w:rPr/>
-            </w:pPr>
-            <w:r>
-              <w:rPr>
-                <w:sz w:val="18"/>
-                <w:szCs w:val="18"/>
-                <w:rtl w:val="0"/>
-              </w:rPr>
-              <w:t xml:space="preserve">Association between articles and mentioned coins, with primary flag.</w:t>
-            </w:r>
-            <w:r>
-              <w:rPr>
-                <w:rtl w:val="0"/>
-              </w:rPr>
+              <w:t>31</w:t>
+            </w:r>
+          </w:p>
+        </w:tc>
+        <w:tc>
+          <w:tcPr/>
+          <w:p>
+            <w:pPr>
+              <w:rPr/>
+            </w:pPr>
+            <w:r>
+              <w:rPr>
+                <w:sz w:val="18"/>
+                <w:szCs w:val="18"/>
+                <w:rtl w:val="0"/>
+              </w:rPr>
+              <w:t>NEWS_TAG</w:t>
+            </w:r>
+          </w:p>
+        </w:tc>
+        <w:tc>
+          <w:tcPr/>
+          <w:p>
+            <w:pPr>
+              <w:rPr/>
+            </w:pPr>
+            <w:r>
+              <w:rPr>
+                <w:sz w:val="18"/>
+                <w:szCs w:val="18"/>
+                <w:rtl w:val="0"/>
+              </w:rPr>
+              <w:t>Topic tag of news articles.</w:t>
             </w:r>
           </w:p>
         </w:tc>
@@ -27210,54 +26752,39 @@
                 <w:szCs w:val="18"/>
                 <w:rtl w:val="0"/>
               </w:rPr>
-              <w:t xml:space="preserve">32</w:t>
-            </w:r>
-            <w:r>
-              <w:rPr>
-                <w:rtl w:val="0"/>
-              </w:rPr>
-            </w:r>
-          </w:p>
-        </w:tc>
-        <w:tc>
-          <w:tcPr/>
-          <w:p>
-            <w:pPr>
-              <w:rPr/>
-            </w:pPr>
-            <w:r>
-              <w:rPr>
-                <w:sz w:val="18"/>
-                <w:szCs w:val="18"/>
-                <w:rtl w:val="0"/>
-              </w:rPr>
-              <w:t xml:space="preserve">AI_CONVERSATION</w:t>
-            </w:r>
-            <w:r>
-              <w:rPr>
-                <w:rtl w:val="0"/>
-              </w:rPr>
-            </w:r>
-          </w:p>
-        </w:tc>
-        <w:tc>
-          <w:tcPr/>
-          <w:p>
-            <w:pPr>
-              <w:rPr/>
-            </w:pPr>
-            <w:r>
-              <w:rPr>
-                <w:sz w:val="18"/>
-                <w:szCs w:val="18"/>
-                <w:rtl w:val="0"/>
-              </w:rPr>
-              <w:t xml:space="preserve">Conversation of a Trader with the AI Assistant, optionally in the context of a pair.</w:t>
-            </w:r>
-            <w:r>
-              <w:rPr>
-                <w:rtl w:val="0"/>
-              </w:rPr>
+              <w:t>32</w:t>
+            </w:r>
+          </w:p>
+        </w:tc>
+        <w:tc>
+          <w:tcPr/>
+          <w:p>
+            <w:pPr>
+              <w:rPr/>
+            </w:pPr>
+            <w:r>
+              <w:rPr>
+                <w:sz w:val="18"/>
+                <w:szCs w:val="18"/>
+                <w:rtl w:val="0"/>
+              </w:rPr>
+              <w:t>NEWS_ARTICLE_TAG</w:t>
+            </w:r>
+          </w:p>
+        </w:tc>
+        <w:tc>
+          <w:tcPr/>
+          <w:p>
+            <w:pPr>
+              <w:rPr/>
+            </w:pPr>
+            <w:r>
+              <w:rPr>
+                <w:sz w:val="18"/>
+                <w:szCs w:val="18"/>
+                <w:rtl w:val="0"/>
+              </w:rPr>
+              <w:t>Association between articles and topic tags.</w:t>
             </w:r>
           </w:p>
         </w:tc>
@@ -27280,54 +26807,39 @@
                 <w:szCs w:val="18"/>
                 <w:rtl w:val="0"/>
               </w:rPr>
-              <w:t xml:space="preserve">33</w:t>
-            </w:r>
-            <w:r>
-              <w:rPr>
-                <w:rtl w:val="0"/>
-              </w:rPr>
-            </w:r>
-          </w:p>
-        </w:tc>
-        <w:tc>
-          <w:tcPr/>
-          <w:p>
-            <w:pPr>
-              <w:rPr/>
-            </w:pPr>
-            <w:r>
-              <w:rPr>
-                <w:sz w:val="18"/>
-                <w:szCs w:val="18"/>
-                <w:rtl w:val="0"/>
-              </w:rPr>
-              <w:t xml:space="preserve">AI_MESSAGE</w:t>
-            </w:r>
-            <w:r>
-              <w:rPr>
-                <w:rtl w:val="0"/>
-              </w:rPr>
-            </w:r>
-          </w:p>
-        </w:tc>
-        <w:tc>
-          <w:tcPr/>
-          <w:p>
-            <w:pPr>
-              <w:rPr/>
-            </w:pPr>
-            <w:r>
-              <w:rPr>
-                <w:sz w:val="18"/>
-                <w:szCs w:val="18"/>
-                <w:rtl w:val="0"/>
-              </w:rPr>
-              <w:t xml:space="preserve">Question or answer in a conversation with context snapshot, token usage and status.</w:t>
-            </w:r>
-            <w:r>
-              <w:rPr>
-                <w:rtl w:val="0"/>
-              </w:rPr>
+              <w:t>33</w:t>
+            </w:r>
+          </w:p>
+        </w:tc>
+        <w:tc>
+          <w:tcPr/>
+          <w:p>
+            <w:pPr>
+              <w:rPr/>
+            </w:pPr>
+            <w:r>
+              <w:rPr>
+                <w:sz w:val="18"/>
+                <w:szCs w:val="18"/>
+                <w:rtl w:val="0"/>
+              </w:rPr>
+              <w:t>NEWS_ARTICLE_COIN</w:t>
+            </w:r>
+          </w:p>
+        </w:tc>
+        <w:tc>
+          <w:tcPr/>
+          <w:p>
+            <w:pPr>
+              <w:rPr/>
+            </w:pPr>
+            <w:r>
+              <w:rPr>
+                <w:sz w:val="18"/>
+                <w:szCs w:val="18"/>
+                <w:rtl w:val="0"/>
+              </w:rPr>
+              <w:t>Association between articles and mentioned coins, with primary flag.</w:t>
             </w:r>
           </w:p>
         </w:tc>
@@ -27350,54 +26862,39 @@
                 <w:szCs w:val="18"/>
                 <w:rtl w:val="0"/>
               </w:rPr>
-              <w:t xml:space="preserve">34</w:t>
-            </w:r>
-            <w:r>
-              <w:rPr>
-                <w:rtl w:val="0"/>
-              </w:rPr>
-            </w:r>
-          </w:p>
-        </w:tc>
-        <w:tc>
-          <w:tcPr/>
-          <w:p>
-            <w:pPr>
-              <w:rPr/>
-            </w:pPr>
-            <w:r>
-              <w:rPr>
-                <w:sz w:val="18"/>
-                <w:szCs w:val="18"/>
-                <w:rtl w:val="0"/>
-              </w:rPr>
-              <w:t xml:space="preserve">AI_CONFIGURATION</w:t>
-            </w:r>
-            <w:r>
-              <w:rPr>
-                <w:rtl w:val="0"/>
-              </w:rPr>
-            </w:r>
-          </w:p>
-        </w:tc>
-        <w:tc>
-          <w:tcPr/>
-          <w:p>
-            <w:pPr>
-              <w:rPr/>
-            </w:pPr>
-            <w:r>
-              <w:rPr>
-                <w:sz w:val="18"/>
-                <w:szCs w:val="18"/>
-                <w:rtl w:val="0"/>
-              </w:rPr>
-              <w:t xml:space="preserve">Versioned AI settings (model, system prompt, temperature, token limit); exactly one active.</w:t>
-            </w:r>
-            <w:r>
-              <w:rPr>
-                <w:rtl w:val="0"/>
-              </w:rPr>
+              <w:t>34</w:t>
+            </w:r>
+          </w:p>
+        </w:tc>
+        <w:tc>
+          <w:tcPr/>
+          <w:p>
+            <w:pPr>
+              <w:rPr/>
+            </w:pPr>
+            <w:r>
+              <w:rPr>
+                <w:sz w:val="18"/>
+                <w:szCs w:val="18"/>
+                <w:rtl w:val="0"/>
+              </w:rPr>
+              <w:t>AI_CONVERSATION</w:t>
+            </w:r>
+          </w:p>
+        </w:tc>
+        <w:tc>
+          <w:tcPr/>
+          <w:p>
+            <w:pPr>
+              <w:rPr/>
+            </w:pPr>
+            <w:r>
+              <w:rPr>
+                <w:sz w:val="18"/>
+                <w:szCs w:val="18"/>
+                <w:rtl w:val="0"/>
+              </w:rPr>
+              <w:t>Conversation of a Trader with the AI Assistant, optionally in the context of a pair.</w:t>
             </w:r>
           </w:p>
         </w:tc>
@@ -27420,54 +26917,39 @@
                 <w:szCs w:val="18"/>
                 <w:rtl w:val="0"/>
               </w:rPr>
-              <w:t xml:space="preserve">35</w:t>
-            </w:r>
-            <w:r>
-              <w:rPr>
-                <w:rtl w:val="0"/>
-              </w:rPr>
-            </w:r>
-          </w:p>
-        </w:tc>
-        <w:tc>
-          <w:tcPr/>
-          <w:p>
-            <w:pPr>
-              <w:rPr/>
-            </w:pPr>
-            <w:r>
-              <w:rPr>
-                <w:sz w:val="18"/>
-                <w:szCs w:val="18"/>
-                <w:rtl w:val="0"/>
-              </w:rPr>
-              <w:t xml:space="preserve">SUBSCRIPTION_PACKAGE</w:t>
-            </w:r>
-            <w:r>
-              <w:rPr>
-                <w:rtl w:val="0"/>
-              </w:rPr>
-            </w:r>
-          </w:p>
-        </w:tc>
-        <w:tc>
-          <w:tcPr/>
-          <w:p>
-            <w:pPr>
-              <w:rPr/>
-            </w:pPr>
-            <w:r>
-              <w:rPr>
-                <w:sz w:val="18"/>
-                <w:szCs w:val="18"/>
-                <w:rtl w:val="0"/>
-              </w:rPr>
-              <w:t>Package of a plan tier (FREE, PRO, PREMIUM) with tier rank, price, duration, purchasable flag, active flag and the entitlements of the tier (Table 3.1): Futures analysis, setup score components, maximum ACTIVE plans and open positions, watchlist items, active alerts, indicator alerts, external alert channels, full performance dashboard, news AI insight, AI daily quota, AI performance context, video posts per calendar month. FREE is a single package that cannot be purchased.</w:t>
-            </w:r>
-            <w:r>
-              <w:rPr>
-                <w:rtl w:val="0"/>
-              </w:rPr>
+              <w:t>35</w:t>
+            </w:r>
+          </w:p>
+        </w:tc>
+        <w:tc>
+          <w:tcPr/>
+          <w:p>
+            <w:pPr>
+              <w:rPr/>
+            </w:pPr>
+            <w:r>
+              <w:rPr>
+                <w:sz w:val="18"/>
+                <w:szCs w:val="18"/>
+                <w:rtl w:val="0"/>
+              </w:rPr>
+              <w:t>AI_MESSAGE</w:t>
+            </w:r>
+          </w:p>
+        </w:tc>
+        <w:tc>
+          <w:tcPr/>
+          <w:p>
+            <w:pPr>
+              <w:rPr/>
+            </w:pPr>
+            <w:r>
+              <w:rPr>
+                <w:sz w:val="18"/>
+                <w:szCs w:val="18"/>
+                <w:rtl w:val="0"/>
+              </w:rPr>
+              <w:t>Question or answer in a conversation with context snapshot, token usage and status.</w:t>
             </w:r>
           </w:p>
         </w:tc>
@@ -27490,54 +26972,39 @@
                 <w:szCs w:val="18"/>
                 <w:rtl w:val="0"/>
               </w:rPr>
-              <w:t xml:space="preserve">36</w:t>
-            </w:r>
-            <w:r>
-              <w:rPr>
-                <w:rtl w:val="0"/>
-              </w:rPr>
-            </w:r>
-          </w:p>
-        </w:tc>
-        <w:tc>
-          <w:tcPr/>
-          <w:p>
-            <w:pPr>
-              <w:rPr/>
-            </w:pPr>
-            <w:r>
-              <w:rPr>
-                <w:sz w:val="18"/>
-                <w:szCs w:val="18"/>
-                <w:rtl w:val="0"/>
-              </w:rPr>
-              <w:t xml:space="preserve">SUBSCRIPTION_ORDER</w:t>
-            </w:r>
-            <w:r>
-              <w:rPr>
-                <w:rtl w:val="0"/>
-              </w:rPr>
-            </w:r>
-          </w:p>
-        </w:tc>
-        <w:tc>
-          <w:tcPr/>
-          <w:p>
-            <w:pPr>
-              <w:rPr/>
-            </w:pPr>
-            <w:r>
-              <w:rPr>
-                <w:sz w:val="18"/>
-                <w:szCs w:val="18"/>
-                <w:rtl w:val="0"/>
-              </w:rPr>
-              <w:t xml:space="preserve">Purchase of a package by a Trader: order type (NEW, RENEW, UPGRADE, DOWNGRADE), list price, upgrade credit, amount, gateway, status, manual-handling flag and gateway transaction data.</w:t>
-            </w:r>
-            <w:r>
-              <w:rPr>
-                <w:rtl w:val="0"/>
-              </w:rPr>
+              <w:t>36</w:t>
+            </w:r>
+          </w:p>
+        </w:tc>
+        <w:tc>
+          <w:tcPr/>
+          <w:p>
+            <w:pPr>
+              <w:rPr/>
+            </w:pPr>
+            <w:r>
+              <w:rPr>
+                <w:sz w:val="18"/>
+                <w:szCs w:val="18"/>
+                <w:rtl w:val="0"/>
+              </w:rPr>
+              <w:t>AI_CONFIGURATION</w:t>
+            </w:r>
+          </w:p>
+        </w:tc>
+        <w:tc>
+          <w:tcPr/>
+          <w:p>
+            <w:pPr>
+              <w:rPr/>
+            </w:pPr>
+            <w:r>
+              <w:rPr>
+                <w:sz w:val="18"/>
+                <w:szCs w:val="18"/>
+                <w:rtl w:val="0"/>
+              </w:rPr>
+              <w:t>Versioned AI settings (model, system prompt, temperature, token limit); exactly one active.</w:t>
             </w:r>
           </w:p>
         </w:tc>
@@ -27560,54 +27027,39 @@
                 <w:szCs w:val="18"/>
                 <w:rtl w:val="0"/>
               </w:rPr>
-              <w:t xml:space="preserve">37</w:t>
-            </w:r>
-            <w:r>
-              <w:rPr>
-                <w:rtl w:val="0"/>
-              </w:rPr>
-            </w:r>
-          </w:p>
-        </w:tc>
-        <w:tc>
-          <w:tcPr/>
-          <w:p>
-            <w:pPr>
-              <w:rPr/>
-            </w:pPr>
-            <w:r>
-              <w:rPr>
-                <w:sz w:val="18"/>
-                <w:szCs w:val="18"/>
-                <w:rtl w:val="0"/>
-              </w:rPr>
-              <w:t xml:space="preserve">USER_SUBSCRIPTION</w:t>
-            </w:r>
-            <w:r>
-              <w:rPr>
-                <w:rtl w:val="0"/>
-              </w:rPr>
-            </w:r>
-          </w:p>
-        </w:tc>
-        <w:tc>
-          <w:tcPr/>
-          <w:p>
-            <w:pPr>
-              <w:rPr/>
-            </w:pPr>
-            <w:r>
-              <w:rPr>
-                <w:sz w:val="18"/>
-                <w:szCs w:val="18"/>
-                <w:rtl w:val="0"/>
-              </w:rPr>
-              <w:t xml:space="preserve">Subscription period created by a paid order, with start, end and status (SCHEDULED, ACTIVE, EXPIRED, REPLACED); at most one ACTIVE subscription per Trader.</w:t>
-            </w:r>
-            <w:r>
-              <w:rPr>
-                <w:rtl w:val="0"/>
-              </w:rPr>
+              <w:t>37</w:t>
+            </w:r>
+          </w:p>
+        </w:tc>
+        <w:tc>
+          <w:tcPr/>
+          <w:p>
+            <w:pPr>
+              <w:rPr/>
+            </w:pPr>
+            <w:r>
+              <w:rPr>
+                <w:sz w:val="18"/>
+                <w:szCs w:val="18"/>
+                <w:rtl w:val="0"/>
+              </w:rPr>
+              <w:t>SUBSCRIPTION_PACKAGE</w:t>
+            </w:r>
+          </w:p>
+        </w:tc>
+        <w:tc>
+          <w:tcPr/>
+          <w:p>
+            <w:pPr>
+              <w:rPr/>
+            </w:pPr>
+            <w:r>
+              <w:rPr>
+                <w:sz w:val="18"/>
+                <w:szCs w:val="18"/>
+                <w:rtl w:val="0"/>
+              </w:rPr>
+              <w:t>Package of a plan tier (FREE, PRO, PREMIUM) with tier rank, price, duration, purchasable flag, active flag and the entitlements of the tier (Table 3.1): Futures analysis, setup score components, maximum ACTIVE plans and open positions, watchlist items, active alerts, indicator alerts, external alert channels, full performance dashboard, news AI insight, AI daily quota, AI performance context, video posts per calendar month. FREE is a single package that cannot be purchased.</w:t>
             </w:r>
           </w:p>
         </w:tc>
@@ -27630,54 +27082,39 @@
                 <w:szCs w:val="18"/>
                 <w:rtl w:val="0"/>
               </w:rPr>
-              <w:t xml:space="preserve">38</w:t>
-            </w:r>
-            <w:r>
-              <w:rPr>
-                <w:rtl w:val="0"/>
-              </w:rPr>
-            </w:r>
-          </w:p>
-        </w:tc>
-        <w:tc>
-          <w:tcPr/>
-          <w:p>
-            <w:pPr>
-              <w:rPr/>
-            </w:pPr>
-            <w:r>
-              <w:rPr>
-                <w:sz w:val="18"/>
-                <w:szCs w:val="18"/>
-                <w:rtl w:val="0"/>
-              </w:rPr>
-              <w:t xml:space="preserve">SYSTEM_SETTING</w:t>
-            </w:r>
-            <w:r>
-              <w:rPr>
-                <w:rtl w:val="0"/>
-              </w:rPr>
-            </w:r>
-          </w:p>
-        </w:tc>
-        <w:tc>
-          <w:tcPr/>
-          <w:p>
-            <w:pPr>
-              <w:rPr/>
-            </w:pPr>
-            <w:r>
-              <w:rPr>
-                <w:sz w:val="18"/>
-                <w:szCs w:val="18"/>
-                <w:rtl w:val="0"/>
-              </w:rPr>
-              <w:t xml:space="preserve">Key-value configuration maintained by Admin (limits, fee rates, warning thresholds).</w:t>
-            </w:r>
-            <w:r>
-              <w:rPr>
-                <w:rtl w:val="0"/>
-              </w:rPr>
+              <w:t>38</w:t>
+            </w:r>
+          </w:p>
+        </w:tc>
+        <w:tc>
+          <w:tcPr/>
+          <w:p>
+            <w:pPr>
+              <w:rPr/>
+            </w:pPr>
+            <w:r>
+              <w:rPr>
+                <w:sz w:val="18"/>
+                <w:szCs w:val="18"/>
+                <w:rtl w:val="0"/>
+              </w:rPr>
+              <w:t>SUBSCRIPTION_ORDER</w:t>
+            </w:r>
+          </w:p>
+        </w:tc>
+        <w:tc>
+          <w:tcPr/>
+          <w:p>
+            <w:pPr>
+              <w:rPr/>
+            </w:pPr>
+            <w:r>
+              <w:rPr>
+                <w:sz w:val="18"/>
+                <w:szCs w:val="18"/>
+                <w:rtl w:val="0"/>
+              </w:rPr>
+              <w:t>Purchase of a package by a Trader: order type (NEW, RENEW, UPGRADE, DOWNGRADE), list price, upgrade credit, amount, gateway, status, manual-handling flag and gateway transaction data.</w:t>
             </w:r>
           </w:p>
         </w:tc>
@@ -27700,54 +27137,39 @@
                 <w:szCs w:val="18"/>
                 <w:rtl w:val="0"/>
               </w:rPr>
-              <w:t xml:space="preserve">39</w:t>
-            </w:r>
-            <w:r>
-              <w:rPr>
-                <w:rtl w:val="0"/>
-              </w:rPr>
-            </w:r>
-          </w:p>
-        </w:tc>
-        <w:tc>
-          <w:tcPr/>
-          <w:p>
-            <w:pPr>
-              <w:rPr/>
-            </w:pPr>
-            <w:r>
-              <w:rPr>
-                <w:sz w:val="18"/>
-                <w:szCs w:val="18"/>
-                <w:rtl w:val="0"/>
-              </w:rPr>
-              <w:t xml:space="preserve">AUDIT_LOG</w:t>
-            </w:r>
-            <w:r>
-              <w:rPr>
-                <w:rtl w:val="0"/>
-              </w:rPr>
-            </w:r>
-          </w:p>
-        </w:tc>
-        <w:tc>
-          <w:tcPr/>
-          <w:p>
-            <w:pPr>
-              <w:rPr/>
-            </w:pPr>
-            <w:r>
-              <w:rPr>
-                <w:sz w:val="18"/>
-                <w:szCs w:val="18"/>
-                <w:rtl w:val="0"/>
-              </w:rPr>
-              <w:t xml:space="preserve">Log of administrative and security-relevant actions with actor, entity, old and new values.</w:t>
-            </w:r>
-            <w:r>
-              <w:rPr>
-                <w:rtl w:val="0"/>
-              </w:rPr>
+              <w:t>39</w:t>
+            </w:r>
+          </w:p>
+        </w:tc>
+        <w:tc>
+          <w:tcPr/>
+          <w:p>
+            <w:pPr>
+              <w:rPr/>
+            </w:pPr>
+            <w:r>
+              <w:rPr>
+                <w:sz w:val="18"/>
+                <w:szCs w:val="18"/>
+                <w:rtl w:val="0"/>
+              </w:rPr>
+              <w:t>USER_SUBSCRIPTION</w:t>
+            </w:r>
+          </w:p>
+        </w:tc>
+        <w:tc>
+          <w:tcPr/>
+          <w:p>
+            <w:pPr>
+              <w:rPr/>
+            </w:pPr>
+            <w:r>
+              <w:rPr>
+                <w:sz w:val="18"/>
+                <w:szCs w:val="18"/>
+                <w:rtl w:val="0"/>
+              </w:rPr>
+              <w:t>Subscription period created by a paid order, with start, end and status (SCHEDULED, ACTIVE, EXPIRED, REPLACED); at most one ACTIVE subscription per Trader.</w:t>
             </w:r>
           </w:p>
         </w:tc>
@@ -27766,51 +27188,43 @@
             </w:pPr>
             <w:r>
               <w:rPr>
-                <w:rtl w:val="0"/>
-              </w:rPr>
-              <w:t xml:space="preserve">40</w:t>
-            </w:r>
-          </w:p>
-        </w:tc>
-        <w:tc>
-          <w:tcPr/>
-          <w:p>
-            <w:pPr>
-              <w:rPr/>
-            </w:pPr>
-            <w:r>
-              <w:rPr>
-                <w:sz w:val="18"/>
-                <w:szCs w:val="18"/>
-                <w:rtl w:val="0"/>
-              </w:rPr>
-              <w:t xml:space="preserve">PAPER_ACCOUNT</w:t>
-            </w:r>
-            <w:r>
-              <w:rPr>
-                <w:rtl w:val="0"/>
-              </w:rPr>
-            </w:r>
-          </w:p>
-        </w:tc>
-        <w:tc>
-          <w:tcPr/>
-          <w:p>
-            <w:pPr>
-              <w:rPr/>
-            </w:pPr>
-            <w:r>
-              <w:rPr>
-                <w:sz w:val="18"/>
-                <w:szCs w:val="18"/>
-                <w:rtl w:val="0"/>
-              </w:rPr>
-              <w:t xml:space="preserve">Demo trading account of a Trader, at most one per Trader, opened once with the virtual starting funds (BR-68).</w:t>
-            </w:r>
-            <w:r>
-              <w:rPr>
-                <w:rtl w:val="0"/>
-              </w:rPr>
+                <w:sz w:val="18"/>
+                <w:szCs w:val="18"/>
+                <w:rtl w:val="0"/>
+              </w:rPr>
+              <w:t>40</w:t>
+            </w:r>
+          </w:p>
+        </w:tc>
+        <w:tc>
+          <w:tcPr/>
+          <w:p>
+            <w:pPr>
+              <w:rPr/>
+            </w:pPr>
+            <w:r>
+              <w:rPr>
+                <w:sz w:val="18"/>
+                <w:szCs w:val="18"/>
+                <w:rtl w:val="0"/>
+              </w:rPr>
+              <w:t>SYSTEM_SETTING</w:t>
+            </w:r>
+          </w:p>
+        </w:tc>
+        <w:tc>
+          <w:tcPr/>
+          <w:p>
+            <w:pPr>
+              <w:rPr/>
+            </w:pPr>
+            <w:r>
+              <w:rPr>
+                <w:sz w:val="18"/>
+                <w:szCs w:val="18"/>
+                <w:rtl w:val="0"/>
+              </w:rPr>
+              <w:t>Key-value configuration maintained by Admin (limits, fee rates, warning thresholds).</w:t>
             </w:r>
           </w:p>
         </w:tc>
@@ -27829,51 +27243,43 @@
             </w:pPr>
             <w:r>
               <w:rPr>
-                <w:rtl w:val="0"/>
-              </w:rPr>
-              <w:t xml:space="preserve">41</w:t>
-            </w:r>
-          </w:p>
-        </w:tc>
-        <w:tc>
-          <w:tcPr/>
-          <w:p>
-            <w:pPr>
-              <w:rPr/>
-            </w:pPr>
-            <w:r>
-              <w:rPr>
-                <w:sz w:val="18"/>
-                <w:szCs w:val="18"/>
-                <w:rtl w:val="0"/>
-              </w:rPr>
-              <w:t xml:space="preserve">PAPER_BALANCE</w:t>
-            </w:r>
-            <w:r>
-              <w:rPr>
-                <w:rtl w:val="0"/>
-              </w:rPr>
-            </w:r>
-          </w:p>
-        </w:tc>
-        <w:tc>
-          <w:tcPr/>
-          <w:p>
-            <w:pPr>
-              <w:rPr/>
-            </w:pPr>
-            <w:r>
-              <w:rPr>
-                <w:sz w:val="18"/>
-                <w:szCs w:val="18"/>
-                <w:rtl w:val="0"/>
-              </w:rPr>
-              <w:t xml:space="preserve">Balance of one coin in the Spot or Futures demo wallet: free and locked amount and average cost in USDT (BR-73).</w:t>
-            </w:r>
-            <w:r>
-              <w:rPr>
-                <w:rtl w:val="0"/>
-              </w:rPr>
+                <w:sz w:val="18"/>
+                <w:szCs w:val="18"/>
+                <w:rtl w:val="0"/>
+              </w:rPr>
+              <w:t>41</w:t>
+            </w:r>
+          </w:p>
+        </w:tc>
+        <w:tc>
+          <w:tcPr/>
+          <w:p>
+            <w:pPr>
+              <w:rPr/>
+            </w:pPr>
+            <w:r>
+              <w:rPr>
+                <w:sz w:val="18"/>
+                <w:szCs w:val="18"/>
+                <w:rtl w:val="0"/>
+              </w:rPr>
+              <w:t>AUDIT_LOG</w:t>
+            </w:r>
+          </w:p>
+        </w:tc>
+        <w:tc>
+          <w:tcPr/>
+          <w:p>
+            <w:pPr>
+              <w:rPr/>
+            </w:pPr>
+            <w:r>
+              <w:rPr>
+                <w:sz w:val="18"/>
+                <w:szCs w:val="18"/>
+                <w:rtl w:val="0"/>
+              </w:rPr>
+              <w:t>Log of administrative and security-relevant actions with actor, entity, old and new values.</w:t>
             </w:r>
           </w:p>
         </w:tc>
@@ -27892,51 +27298,43 @@
             </w:pPr>
             <w:r>
               <w:rPr>
-                <w:rtl w:val="0"/>
-              </w:rPr>
-              <w:t xml:space="preserve">42</w:t>
-            </w:r>
-          </w:p>
-        </w:tc>
-        <w:tc>
-          <w:tcPr/>
-          <w:p>
-            <w:pPr>
-              <w:rPr/>
-            </w:pPr>
-            <w:r>
-              <w:rPr>
-                <w:sz w:val="18"/>
-                <w:szCs w:val="18"/>
-                <w:rtl w:val="0"/>
-              </w:rPr>
-              <w:t xml:space="preserve">PAPER_LEDGER_ENTRY</w:t>
-            </w:r>
-            <w:r>
-              <w:rPr>
-                <w:rtl w:val="0"/>
-              </w:rPr>
-            </w:r>
-          </w:p>
-        </w:tc>
-        <w:tc>
-          <w:tcPr/>
-          <w:p>
-            <w:pPr>
-              <w:rPr/>
-            </w:pPr>
-            <w:r>
-              <w:rPr>
-                <w:sz w:val="18"/>
-                <w:szCs w:val="18"/>
-                <w:rtl w:val="0"/>
-              </w:rPr>
-              <w:t xml:space="preserve">Immutable record of one demo balance change with its type and the balance after it (BR-69).</w:t>
-            </w:r>
-            <w:r>
-              <w:rPr>
-                <w:rtl w:val="0"/>
-              </w:rPr>
+                <w:sz w:val="18"/>
+                <w:szCs w:val="18"/>
+                <w:rtl w:val="0"/>
+              </w:rPr>
+              <w:t>42</w:t>
+            </w:r>
+          </w:p>
+        </w:tc>
+        <w:tc>
+          <w:tcPr/>
+          <w:p>
+            <w:pPr>
+              <w:rPr/>
+            </w:pPr>
+            <w:r>
+              <w:rPr>
+                <w:sz w:val="18"/>
+                <w:szCs w:val="18"/>
+                <w:rtl w:val="0"/>
+              </w:rPr>
+              <w:t>WALLET_BALANCE</w:t>
+            </w:r>
+          </w:p>
+        </w:tc>
+        <w:tc>
+          <w:tcPr/>
+          <w:p>
+            <w:pPr>
+              <w:rPr/>
+            </w:pPr>
+            <w:r>
+              <w:rPr>
+                <w:sz w:val="18"/>
+                <w:szCs w:val="18"/>
+                <w:rtl w:val="0"/>
+              </w:rPr>
+              <w:t>Balance of one coin in the Spot or Futures demo wallet of a Trader: free and locked amount and average cost in USDT (BR-73).</w:t>
             </w:r>
           </w:p>
         </w:tc>
@@ -27955,51 +27353,43 @@
             </w:pPr>
             <w:r>
               <w:rPr>
-                <w:rtl w:val="0"/>
-              </w:rPr>
-              <w:t xml:space="preserve">43</w:t>
-            </w:r>
-          </w:p>
-        </w:tc>
-        <w:tc>
-          <w:tcPr/>
-          <w:p>
-            <w:pPr>
-              <w:rPr/>
-            </w:pPr>
-            <w:r>
-              <w:rPr>
-                <w:sz w:val="18"/>
-                <w:szCs w:val="18"/>
-                <w:rtl w:val="0"/>
-              </w:rPr>
-              <w:t xml:space="preserve">PAPER_TRANSFER</w:t>
-            </w:r>
-            <w:r>
-              <w:rPr>
-                <w:rtl w:val="0"/>
-              </w:rPr>
-            </w:r>
-          </w:p>
-        </w:tc>
-        <w:tc>
-          <w:tcPr/>
-          <w:p>
-            <w:pPr>
-              <w:rPr/>
-            </w:pPr>
-            <w:r>
-              <w:rPr>
-                <w:sz w:val="18"/>
-                <w:szCs w:val="18"/>
-                <w:rtl w:val="0"/>
-              </w:rPr>
-              <w:t xml:space="preserve">Transfer of USDT between the Spot and Futures demo wallets, unique per client transfer id.</w:t>
-            </w:r>
-            <w:r>
-              <w:rPr>
-                <w:rtl w:val="0"/>
-              </w:rPr>
+                <w:sz w:val="18"/>
+                <w:szCs w:val="18"/>
+                <w:rtl w:val="0"/>
+              </w:rPr>
+              <w:t>43</w:t>
+            </w:r>
+          </w:p>
+        </w:tc>
+        <w:tc>
+          <w:tcPr/>
+          <w:p>
+            <w:pPr>
+              <w:rPr/>
+            </w:pPr>
+            <w:r>
+              <w:rPr>
+                <w:sz w:val="18"/>
+                <w:szCs w:val="18"/>
+                <w:rtl w:val="0"/>
+              </w:rPr>
+              <w:t>WALLET_LEDGER_ENTRY</w:t>
+            </w:r>
+          </w:p>
+        </w:tc>
+        <w:tc>
+          <w:tcPr/>
+          <w:p>
+            <w:pPr>
+              <w:rPr/>
+            </w:pPr>
+            <w:r>
+              <w:rPr>
+                <w:sz w:val="18"/>
+                <w:szCs w:val="18"/>
+                <w:rtl w:val="0"/>
+              </w:rPr>
+              <w:t>Immutable record of one demo balance change with its type and the balance after it; a transfer between the Spot and Futures wallets is a pair of TRANSFER entries, unique per client transfer id (BR-69).</w:t>
             </w:r>
           </w:p>
         </w:tc>
@@ -28018,51 +27408,43 @@
             </w:pPr>
             <w:r>
               <w:rPr>
-                <w:rtl w:val="0"/>
-              </w:rPr>
-              <w:t xml:space="preserve">44</w:t>
-            </w:r>
-          </w:p>
-        </w:tc>
-        <w:tc>
-          <w:tcPr/>
-          <w:p>
-            <w:pPr>
-              <w:rPr/>
-            </w:pPr>
-            <w:r>
-              <w:rPr>
-                <w:sz w:val="18"/>
-                <w:szCs w:val="18"/>
-                <w:rtl w:val="0"/>
-              </w:rPr>
-              <w:t xml:space="preserve">PAPER_ORDER</w:t>
-            </w:r>
-            <w:r>
-              <w:rPr>
-                <w:rtl w:val="0"/>
-              </w:rPr>
-            </w:r>
-          </w:p>
-        </w:tc>
-        <w:tc>
-          <w:tcPr/>
-          <w:p>
-            <w:pPr>
-              <w:rPr/>
-            </w:pPr>
-            <w:r>
-              <w:rPr>
-                <w:sz w:val="18"/>
-                <w:szCs w:val="18"/>
-                <w:rtl w:val="0"/>
-              </w:rPr>
-              <w:t xml:space="preserve">Demo order: pair, market, side, type, time in force, prices, quantities, filled and locked amounts, status and status reason; unique per client order id.</w:t>
-            </w:r>
-            <w:r>
-              <w:rPr>
-                <w:rtl w:val="0"/>
-              </w:rPr>
+                <w:sz w:val="18"/>
+                <w:szCs w:val="18"/>
+                <w:rtl w:val="0"/>
+              </w:rPr>
+              <w:t>44</w:t>
+            </w:r>
+          </w:p>
+        </w:tc>
+        <w:tc>
+          <w:tcPr/>
+          <w:p>
+            <w:pPr>
+              <w:rPr/>
+            </w:pPr>
+            <w:r>
+              <w:rPr>
+                <w:sz w:val="18"/>
+                <w:szCs w:val="18"/>
+                <w:rtl w:val="0"/>
+              </w:rPr>
+              <w:t>TRADE_ORDER</w:t>
+            </w:r>
+          </w:p>
+        </w:tc>
+        <w:tc>
+          <w:tcPr/>
+          <w:p>
+            <w:pPr>
+              <w:rPr/>
+            </w:pPr>
+            <w:r>
+              <w:rPr>
+                <w:sz w:val="18"/>
+                <w:szCs w:val="18"/>
+                <w:rtl w:val="0"/>
+              </w:rPr>
+              <w:t>Demo order: pair, market, side, type, time in force, prices, quantities, filled and locked amounts, status and status reason; unique per client order id.</w:t>
             </w:r>
           </w:p>
         </w:tc>
@@ -28081,51 +27463,43 @@
             </w:pPr>
             <w:r>
               <w:rPr>
-                <w:rtl w:val="0"/>
-              </w:rPr>
-              <w:t xml:space="preserve">45</w:t>
-            </w:r>
-          </w:p>
-        </w:tc>
-        <w:tc>
-          <w:tcPr/>
-          <w:p>
-            <w:pPr>
-              <w:rPr/>
-            </w:pPr>
-            <w:r>
-              <w:rPr>
-                <w:sz w:val="18"/>
-                <w:szCs w:val="18"/>
-                <w:rtl w:val="0"/>
-              </w:rPr>
-              <w:t xml:space="preserve">PAPER_ORDER_LIST</w:t>
-            </w:r>
-            <w:r>
-              <w:rPr>
-                <w:rtl w:val="0"/>
-              </w:rPr>
-            </w:r>
-          </w:p>
-        </w:tc>
-        <w:tc>
-          <w:tcPr/>
-          <w:p>
-            <w:pPr>
-              <w:rPr/>
-            </w:pPr>
-            <w:r>
-              <w:rPr>
-                <w:sz w:val="18"/>
-                <w:szCs w:val="18"/>
-                <w:rtl w:val="0"/>
-              </w:rPr>
-              <w:t xml:space="preserve">Group of linked demo orders (OCO, OTO, OTOCO) with its status.</w:t>
-            </w:r>
-            <w:r>
-              <w:rPr>
-                <w:rtl w:val="0"/>
-              </w:rPr>
+                <w:sz w:val="18"/>
+                <w:szCs w:val="18"/>
+                <w:rtl w:val="0"/>
+              </w:rPr>
+              <w:t>45</w:t>
+            </w:r>
+          </w:p>
+        </w:tc>
+        <w:tc>
+          <w:tcPr/>
+          <w:p>
+            <w:pPr>
+              <w:rPr/>
+            </w:pPr>
+            <w:r>
+              <w:rPr>
+                <w:sz w:val="18"/>
+                <w:szCs w:val="18"/>
+                <w:rtl w:val="0"/>
+              </w:rPr>
+              <w:t>ORDER_LIST</w:t>
+            </w:r>
+          </w:p>
+        </w:tc>
+        <w:tc>
+          <w:tcPr/>
+          <w:p>
+            <w:pPr>
+              <w:rPr/>
+            </w:pPr>
+            <w:r>
+              <w:rPr>
+                <w:sz w:val="18"/>
+                <w:szCs w:val="18"/>
+                <w:rtl w:val="0"/>
+              </w:rPr>
+              <w:t>Group of linked demo orders (OCO, OTO, OTOCO) with its status.</w:t>
             </w:r>
           </w:p>
         </w:tc>
@@ -28144,51 +27518,43 @@
             </w:pPr>
             <w:r>
               <w:rPr>
-                <w:rtl w:val="0"/>
-              </w:rPr>
-              <w:t xml:space="preserve">46</w:t>
-            </w:r>
-          </w:p>
-        </w:tc>
-        <w:tc>
-          <w:tcPr/>
-          <w:p>
-            <w:pPr>
-              <w:rPr/>
-            </w:pPr>
-            <w:r>
-              <w:rPr>
-                <w:sz w:val="18"/>
-                <w:szCs w:val="18"/>
-                <w:rtl w:val="0"/>
-              </w:rPr>
-              <w:t xml:space="preserve">PAPER_FILL</w:t>
-            </w:r>
-            <w:r>
-              <w:rPr>
-                <w:rtl w:val="0"/>
-              </w:rPr>
-            </w:r>
-          </w:p>
-        </w:tc>
-        <w:tc>
-          <w:tcPr/>
-          <w:p>
-            <w:pPr>
-              <w:rPr/>
-            </w:pPr>
-            <w:r>
-              <w:rPr>
-                <w:sz w:val="18"/>
-                <w:szCs w:val="18"/>
-                <w:rtl w:val="0"/>
-              </w:rPr>
-              <w:t xml:space="preserve">Execution of a demo order: price, quantity, fee and fee coin, maker or taker, time, live or replayed, and the USDT price of the quote coin used for the cost.</w:t>
-            </w:r>
-            <w:r>
-              <w:rPr>
-                <w:rtl w:val="0"/>
-              </w:rPr>
+                <w:sz w:val="18"/>
+                <w:szCs w:val="18"/>
+                <w:rtl w:val="0"/>
+              </w:rPr>
+              <w:t>46</w:t>
+            </w:r>
+          </w:p>
+        </w:tc>
+        <w:tc>
+          <w:tcPr/>
+          <w:p>
+            <w:pPr>
+              <w:rPr/>
+            </w:pPr>
+            <w:r>
+              <w:rPr>
+                <w:sz w:val="18"/>
+                <w:szCs w:val="18"/>
+                <w:rtl w:val="0"/>
+              </w:rPr>
+              <w:t>ORDER_FILL</w:t>
+            </w:r>
+          </w:p>
+        </w:tc>
+        <w:tc>
+          <w:tcPr/>
+          <w:p>
+            <w:pPr>
+              <w:rPr/>
+            </w:pPr>
+            <w:r>
+              <w:rPr>
+                <w:sz w:val="18"/>
+                <w:szCs w:val="18"/>
+                <w:rtl w:val="0"/>
+              </w:rPr>
+              <w:t>Execution of a demo order: price, quantity, fee and fee coin, maker or taker, time, live or replayed, and the USDT price of the quote coin used for the cost.</w:t>
             </w:r>
           </w:p>
         </w:tc>
@@ -28207,51 +27573,263 @@
             </w:pPr>
             <w:r>
               <w:rPr>
-                <w:rtl w:val="0"/>
-              </w:rPr>
-              <w:t xml:space="preserve">47</w:t>
-            </w:r>
-          </w:p>
-        </w:tc>
-        <w:tc>
-          <w:tcPr/>
-          <w:p>
-            <w:pPr>
-              <w:rPr/>
-            </w:pPr>
-            <w:r>
-              <w:rPr>
-                <w:sz w:val="18"/>
-                <w:szCs w:val="18"/>
-                <w:rtl w:val="0"/>
-              </w:rPr>
-              <w:t xml:space="preserve">PAPER_EQUITY_SNAPSHOT</w:t>
-            </w:r>
-            <w:r>
-              <w:rPr>
-                <w:rtl w:val="0"/>
-              </w:rPr>
-            </w:r>
-          </w:p>
-        </w:tc>
-        <w:tc>
-          <w:tcPr/>
-          <w:p>
-            <w:pPr>
-              <w:rPr/>
-            </w:pPr>
-            <w:r>
-              <w:rPr>
-                <w:sz w:val="18"/>
-                <w:szCs w:val="18"/>
-                <w:rtl w:val="0"/>
-              </w:rPr>
-              <w:t xml:space="preserve">Worth of a demo account in USDT at the start of a UTC day (NSF-20).</w:t>
-            </w:r>
-            <w:r>
-              <w:rPr>
-                <w:rtl w:val="0"/>
-              </w:rPr>
+                <w:sz w:val="18"/>
+                <w:szCs w:val="18"/>
+                <w:rtl w:val="0"/>
+              </w:rPr>
+              <w:t>47</w:t>
+            </w:r>
+          </w:p>
+        </w:tc>
+        <w:tc>
+          <w:tcPr/>
+          <w:p>
+            <w:pPr>
+              <w:rPr/>
+            </w:pPr>
+            <w:r>
+              <w:rPr>
+                <w:sz w:val="18"/>
+                <w:szCs w:val="18"/>
+                <w:rtl w:val="0"/>
+              </w:rPr>
+              <w:t>EQUITY_SNAPSHOT</w:t>
+            </w:r>
+          </w:p>
+        </w:tc>
+        <w:tc>
+          <w:tcPr/>
+          <w:p>
+            <w:pPr>
+              <w:rPr/>
+            </w:pPr>
+            <w:r>
+              <w:rPr>
+                <w:sz w:val="18"/>
+                <w:szCs w:val="18"/>
+                <w:rtl w:val="0"/>
+              </w:rPr>
+              <w:t>Worth of the demo wallets of a Trader in USDT at the start of a UTC day (NSF-20).</w:t>
+            </w:r>
+          </w:p>
+        </w:tc>
+      </w:tr>
+      <w:tr>
+        <w:trPr>
+          <w:cantSplit w:val="0"/>
+          <w:tblHeader w:val="0"/>
+        </w:trPr>
+        <w:tc>
+          <w:tcPr/>
+          <w:p>
+            <w:pPr>
+              <w:jc w:val="center"/>
+              <w:rPr/>
+            </w:pPr>
+            <w:r>
+              <w:rPr>
+                <w:sz w:val="18"/>
+                <w:szCs w:val="18"/>
+                <w:rtl w:val="0"/>
+              </w:rPr>
+              <w:t>48</w:t>
+            </w:r>
+          </w:p>
+        </w:tc>
+        <w:tc>
+          <w:tcPr/>
+          <w:p>
+            <w:pPr>
+              <w:rPr/>
+            </w:pPr>
+            <w:r>
+              <w:rPr>
+                <w:sz w:val="18"/>
+                <w:szCs w:val="18"/>
+                <w:rtl w:val="0"/>
+              </w:rPr>
+              <w:t>ACADEMY_TOPIC</w:t>
+            </w:r>
+          </w:p>
+        </w:tc>
+        <w:tc>
+          <w:tcPr/>
+          <w:p>
+            <w:pPr>
+              <w:rPr/>
+            </w:pPr>
+            <w:r>
+              <w:rPr>
+                <w:sz w:val="18"/>
+                <w:szCs w:val="18"/>
+                <w:rtl w:val="0"/>
+              </w:rPr>
+              <w:t>Topic of the Academy with its name, description and display order.</w:t>
+            </w:r>
+          </w:p>
+        </w:tc>
+      </w:tr>
+      <w:tr>
+        <w:trPr>
+          <w:cantSplit w:val="0"/>
+          <w:tblHeader w:val="0"/>
+        </w:trPr>
+        <w:tc>
+          <w:tcPr/>
+          <w:p>
+            <w:pPr>
+              <w:jc w:val="center"/>
+              <w:rPr/>
+            </w:pPr>
+            <w:r>
+              <w:rPr>
+                <w:sz w:val="18"/>
+                <w:szCs w:val="18"/>
+                <w:rtl w:val="0"/>
+              </w:rPr>
+              <w:t>49</w:t>
+            </w:r>
+          </w:p>
+        </w:tc>
+        <w:tc>
+          <w:tcPr/>
+          <w:p>
+            <w:pPr>
+              <w:rPr/>
+            </w:pPr>
+            <w:r>
+              <w:rPr>
+                <w:sz w:val="18"/>
+                <w:szCs w:val="18"/>
+                <w:rtl w:val="0"/>
+              </w:rPr>
+              <w:t>ACADEMY_ARTICLE</w:t>
+            </w:r>
+          </w:p>
+        </w:tc>
+        <w:tc>
+          <w:tcPr/>
+          <w:p>
+            <w:pPr>
+              <w:rPr/>
+            </w:pPr>
+            <w:r>
+              <w:rPr>
+                <w:sz w:val="18"/>
+                <w:szCs w:val="18"/>
+                <w:rtl w:val="0"/>
+              </w:rPr>
+              <w:t>Academy lesson: topic, title, summary, content, level, reading time, cover image, publication status and order in the learning path.</w:t>
+            </w:r>
+          </w:p>
+        </w:tc>
+      </w:tr>
+      <w:tr>
+        <w:trPr>
+          <w:cantSplit w:val="0"/>
+          <w:tblHeader w:val="0"/>
+        </w:trPr>
+        <w:tc>
+          <w:tcPr/>
+          <w:p>
+            <w:pPr>
+              <w:jc w:val="center"/>
+              <w:rPr/>
+            </w:pPr>
+            <w:r>
+              <w:rPr>
+                <w:sz w:val="18"/>
+                <w:szCs w:val="18"/>
+                <w:rtl w:val="0"/>
+              </w:rPr>
+              <w:t>50</w:t>
+            </w:r>
+          </w:p>
+        </w:tc>
+        <w:tc>
+          <w:tcPr/>
+          <w:p>
+            <w:pPr>
+              <w:rPr/>
+            </w:pPr>
+            <w:r>
+              <w:rPr>
+                <w:sz w:val="18"/>
+                <w:szCs w:val="18"/>
+                <w:rtl w:val="0"/>
+              </w:rPr>
+              <w:t>ACADEMY_TERM</w:t>
+            </w:r>
+          </w:p>
+        </w:tc>
+        <w:tc>
+          <w:tcPr/>
+          <w:p>
+            <w:pPr>
+              <w:rPr/>
+            </w:pPr>
+            <w:r>
+              <w:rPr>
+                <w:sz w:val="18"/>
+                <w:szCs w:val="18"/>
+                <w:rtl w:val="0"/>
+              </w:rPr>
+              <w:t>Glossary term with its definition, optionally linked to a lesson.</w:t>
+            </w:r>
+          </w:p>
+        </w:tc>
+      </w:tr>
+      <w:tr>
+        <w:trPr>
+          <w:cantSplit w:val="0"/>
+          <w:tblHeader w:val="0"/>
+        </w:trPr>
+        <w:tc>
+          <w:tcPr/>
+          <w:p>
+            <w:pPr>
+              <w:jc w:val="center"/>
+              <w:rPr/>
+            </w:pPr>
+            <w:r>
+              <w:rPr>
+                <w:sz w:val="18"/>
+                <w:szCs w:val="18"/>
+                <w:rtl w:val="0"/>
+              </w:rPr>
+              <w:t>51</w:t>
+            </w:r>
+          </w:p>
+        </w:tc>
+        <w:tc>
+          <w:tcPr/>
+          <w:p>
+            <w:pPr>
+              <w:rPr/>
+            </w:pPr>
+            <w:r>
+              <w:rPr>
+                <w:sz w:val="18"/>
+                <w:szCs w:val="18"/>
+                <w:rtl w:val="0"/>
+              </w:rPr>
+              <w:t>ACADEMY_PROGRESS</w:t>
+            </w:r>
+          </w:p>
+        </w:tc>
+        <w:tc>
+          <w:tcPr/>
+          <w:p>
+            <w:pPr>
+              <w:rPr/>
+            </w:pPr>
+            <w:r>
+              <w:rPr>
+                <w:sz w:val="18"/>
+                <w:szCs w:val="18"/>
+                <w:rtl w:val="0"/>
+              </w:rPr>
+              <w:t>Lesson completed by a Trader; one record per Trader and lesson.</w:t>
             </w:r>
           </w:p>
         </w:tc>
@@ -28279,7 +27857,7 @@
           <w:iCs w:val="1"/>
           <w:rtl w:val="0"/>
         </w:rPr>
-        <w:t xml:space="preserve">Performance statistics by coin, strategy and market are derived views over TRADING_JOURNAL, not stored entities. The demo Futures tables (settings, positions, funding payments) are reserved for Futures demo trading (section 5.4.1, item 25). Technical tables (event publication registry, migration history, exchange ban state, matching watermarks) are not business entities and are not shown in the ERD.</w:t>
+        <w:t>Performance statistics by coin, strategy and market are derived views over TRADING_JOURNAL, not stored entities. Technical tables (event publication registry, migration history, exchange ban state, matching watermarks, dropped backfill gaps, legacy paper rows) are not business entities and are not shown in the ERD.</w:t>
       </w:r>
       <w:r>
         <w:rPr>
@@ -39665,7 +39243,7 @@
           <w:color w:val="000000"/>
           <w:rtl w:val="0"/>
         </w:rPr>
-        <w:t xml:space="preserve">On first entry the system opens one PAPER_ACCOUNT for the Trader and grants the starting funds once (BR-68); opening it again returns the existing account.</w:t>
+        <w:t>On first entry the system opens the Trader's demo account by granting the starting funds once (BR-68); opening it again returns the existing account.</w:t>
       </w:r>
       <w:r>
         <w:rPr>

</xml_diff>